<commit_message>
docs(report,deck): polish final-round report and slide deck
Report: adopt the hand-polished text as the source (docs/competition/FINAL_REPORT.md),
tighten remaining boilerplate, and fix numbers that changed after the reorganization
(8 run groups, 223 tool calls, 65 offline tests, r2 tag). DOCX builder now typesets
three-line tables with captions, hanging-indent lists, justified body text with a
2-character first-line indent, keep-with-next headings/figures, and no forced page
breaks (9 pages, no near-empty pages).

Deck: restore the formal-case slide set (BYZSO 51/51, 23 pages; LLZO 46/10) that the
report describes, keep the team/title cover, rewrite slide 12 as a balanced 2x2 grid
with a boundary strip that mentions the 09-03 supplementary runs, drop the cliché
title on slide 3 and the "3.8 kw" slang on the cover; speaker notes synced.
</commit_message>
<xml_diff>
--- a/submission/复赛报告/复赛报告_SAGE-Mat.docx
+++ b/submission/复赛报告/复赛报告_SAGE-Mat.docx
@@ -2,6 +2,21 @@
 <file path=word/document.xml><?xml version="1.0" encoding="utf-8"?>
 <w:document xmlns:wpc="http://schemas.microsoft.com/office/word/2010/wordprocessingCanvas" xmlns:mc="http://schemas.openxmlformats.org/markup-compatibility/2006" xmlns:o="urn:schemas-microsoft-com:office:office" xmlns:r="http://schemas.openxmlformats.org/officeDocument/2006/relationships" xmlns:m="http://schemas.openxmlformats.org/officeDocument/2006/math" xmlns:v="urn:schemas-microsoft-com:vml" xmlns:wp14="http://schemas.microsoft.com/office/word/2010/wordprocessingDrawing" xmlns:wp="http://schemas.openxmlformats.org/drawingml/2006/wordprocessingDrawing" xmlns:w="http://schemas.openxmlformats.org/wordprocessingml/2006/main" xmlns:w14="http://schemas.microsoft.com/office/word/2010/wordml" xmlns:w10="urn:schemas-microsoft-com:office:word" xmlns:w15="http://schemas.microsoft.com/office/word/2012/wordml" xmlns:wpg="http://schemas.microsoft.com/office/word/2010/wordprocessingGroup" xmlns:wpi="http://schemas.microsoft.com/office/word/2010/wordprocessingInk" xmlns:wne="http://schemas.microsoft.com/office/word/2006/wordml" xmlns:wps="http://schemas.microsoft.com/office/word/2010/wordprocessingShape" xmlns:wpsCustomData="http://www.wps.cn/officeDocument/2013/wpsCustomData" mc:Ignorable="w14 w15 wp14">
   <w:body>
+    <w:p>
+      <w:pPr>
+        <w:spacing w:before="120" w:after="80" w:line="300" w:lineRule="auto"/>
+        <w:jc w:val="center"/>
+      </w:pPr>
+      <w:r>
+        <w:rPr>
+          <w:rFonts w:ascii="Calibri" w:hAnsi="Calibri" w:eastAsia="微软雅黑"/>
+          <w:b/>
+          <w:color w:val="0B2545"/>
+          <w:sz w:val="36"/>
+        </w:rPr>
+        <w:t>SAGE-Mat：面向无机材料发现与合成规划的证据约束自循环智能体</w:t>
+      </w:r>
+    </w:p>
     <w:p>
       <w:pPr>
         <w:spacing w:after="60"/>
@@ -10,16 +25,16 @@
       <w:r>
         <w:rPr>
           <w:rFonts w:ascii="Calibri" w:hAnsi="Calibri" w:eastAsia="微软雅黑"/>
-          <w:b/>
-          <w:color w:val="0B2545"/>
-          <w:sz w:val="40"/>
+          <w:b w:val="0"/>
+          <w:color w:val="5A6573"/>
+          <w:sz w:val="20"/>
         </w:rPr>
-        <w:t>AI for Research赛道｜算法赛复赛报告</w:t>
+        <w:t>GOAI 2026 · AI for Research 算法赛复赛报告 · 材料科学 · 第13队 科学无极</w:t>
       </w:r>
     </w:p>
     <w:p>
       <w:pPr>
-        <w:spacing w:after="200"/>
+        <w:spacing w:before="40" w:after="120"/>
         <w:jc w:val="center"/>
       </w:pPr>
       <w:r>
@@ -27,38 +42,24 @@
           <w:rFonts w:ascii="Calibri" w:hAnsi="Calibri" w:eastAsia="微软雅黑"/>
           <w:b w:val="0"/>
           <w:color w:val="5A6573"/>
-          <w:sz w:val="21"/>
+          <w:sz w:val="18"/>
         </w:rPr>
-        <w:t>第13队 科学无极 · SAGE-Mat：面向无机材料发现与合成规划的证据约束自循环智能体</w:t>
+        <w:t xml:space="preserve">Evidence-Constrained Self-Cyclic Agent for Inorganic Material Discovery &amp; Synthesis Planning</w:t>
       </w:r>
     </w:p>
     <w:p>
       <w:pPr>
-        <w:shd w:val="clear" w:fill="F4F6F9"/>
-        <w:spacing w:before="40" w:after="120"/>
+        <w:pBdr>
+          <w:bottom w:val="single" w:sz="6" w:space="1" w:color="1F4D78"/>
+        </w:pBdr>
+        <w:spacing w:before="0" w:after="200"/>
       </w:pPr>
-      <w:r>
-        <w:rPr>
-          <w:rFonts w:ascii="Calibri" w:hAnsi="Calibri" w:eastAsia="微软雅黑"/>
-          <w:b/>
-          <w:color w:val="1F4D78"/>
-          <w:sz w:val="19"/>
-        </w:rPr>
-        <w:t>说明：</w:t>
-      </w:r>
-      <w:r>
-        <w:rPr>
-          <w:rFonts w:ascii="Calibri" w:hAnsi="Calibri" w:eastAsia="微软雅黑"/>
-          <w:b w:val="0"/>
-          <w:color w:val="0B2545"/>
-          <w:sz w:val="19"/>
-        </w:rPr>
-        <w:t xml:space="preserve">SAGE-Mat: Evidence-Constrained Self-Cyclic Agent for Inorganic Material Discovery &amp; Synthesis Planning。报告中的每个主要结论、图与指标均可追溯到提交包中的代码版本、配置、数据、运行日志与结果文件。</w:t>
-      </w:r>
     </w:p>
     <w:p>
       <w:pPr>
         <w:pStyle w:val="3"/>
+        <w:keepNext/>
+        <w:keepLines/>
       </w:pPr>
       <w:r>
         <w:t>一、项目概述</w:t>
@@ -67,6 +68,8 @@
     <w:p>
       <w:pPr>
         <w:pStyle w:val="4"/>
+        <w:keepNext/>
+        <w:keepLines/>
       </w:pPr>
       <w:r>
         <w:t>1.1 项目名称</w:t>
@@ -74,8 +77,9 @@
     </w:p>
     <w:p>
       <w:pPr>
-        <w:spacing w:after="100" w:line="300" w:lineRule="auto"/>
-        <w:ind w:left="173" w:firstLine="0"/>
+        <w:spacing w:after="80" w:line="330" w:lineRule="auto"/>
+        <w:ind w:firstLine="420"/>
+        <w:jc w:val="both"/>
       </w:pPr>
       <w:r>
         <w:rPr>
@@ -85,12 +89,14 @@
           <w:color w:val="000000"/>
           <w:sz w:val="21"/>
         </w:rPr>
-        <w:t xml:space="preserve">SAGE-Mat：面向无机材料发现与合成规划的证据约束自循环智能体（SAGE-Mat: Evidence-Constrained Self-Cyclic Agent for Inorganic Material Discovery &amp; Synthesis Planning；开源实现名 GoAI Research）。</w:t>
+        <w:t xml:space="preserve">SAGE-Mat：面向无机材料发现与合成规划的证据约束自循环智能体（SAGE-Mat: Evidence-Constrained Self-Cyclic Agent for Inorganic Material Discovery &amp; Synthesis Planning）。开源实现名为 GoAI Research。</w:t>
       </w:r>
     </w:p>
     <w:p>
       <w:pPr>
         <w:pStyle w:val="4"/>
+        <w:keepNext/>
+        <w:keepLines/>
       </w:pPr>
       <w:r>
         <w:t>1.2 参赛方向</w:t>
@@ -98,8 +104,9 @@
     </w:p>
     <w:p>
       <w:pPr>
-        <w:spacing w:after="100" w:line="300" w:lineRule="auto"/>
-        <w:ind w:left="173" w:firstLine="0"/>
+        <w:spacing w:after="80" w:line="330" w:lineRule="auto"/>
+        <w:ind w:firstLine="420"/>
+        <w:jc w:val="both"/>
       </w:pPr>
       <w:r>
         <w:rPr>
@@ -109,12 +116,14 @@
           <w:color w:val="000000"/>
           <w:sz w:val="21"/>
         </w:rPr>
-        <w:t xml:space="preserve">方向三"材料科学文献驱动的科学发现智能体"（材料科学 / MaterialsScience），进阶路线 C"合成路线与工艺设计"。</w:t>
+        <w:t xml:space="preserve">方向三“材料科学文献驱动的科学发现智能体”，进阶路线 C“合成路线与工艺设计”。</w:t>
       </w:r>
     </w:p>
     <w:p>
       <w:pPr>
         <w:pStyle w:val="4"/>
+        <w:keepNext/>
+        <w:keepLines/>
       </w:pPr>
       <w:r>
         <w:t>1.3 方案概述</w:t>
@@ -122,8 +131,9 @@
     </w:p>
     <w:p>
       <w:pPr>
-        <w:spacing w:after="100" w:line="300" w:lineRule="auto"/>
-        <w:ind w:left="173" w:firstLine="0"/>
+        <w:spacing w:after="80" w:line="330" w:lineRule="auto"/>
+        <w:ind w:firstLine="420"/>
+        <w:jc w:val="both"/>
       </w:pPr>
       <w:r>
         <w:rPr>
@@ -133,53 +143,14 @@
           <w:color w:val="000000"/>
           <w:sz w:val="21"/>
         </w:rPr>
-        <w:t xml:space="preserve">本项目交付一个可从</w:t>
-      </w:r>
-      <w:r>
-        <w:rPr>
-          <w:rFonts w:ascii="Calibri" w:hAnsi="Calibri" w:eastAsia="微软雅黑"/>
-          <w:b/>
-          <w:i w:val="0"/>
-          <w:color w:val="000000"/>
-          <w:sz w:val="21"/>
-        </w:rPr>
-        <w:t xml:space="preserve">一行研究主题</w:t>
-      </w:r>
-      <w:r>
-        <w:rPr>
-          <w:rFonts w:ascii="Calibri" w:hAnsi="Calibri" w:eastAsia="微软雅黑"/>
-          <w:b w:val="0"/>
-          <w:i w:val="0"/>
-          <w:color w:val="000000"/>
-          <w:sz w:val="21"/>
-        </w:rPr>
-        <w:t xml:space="preserve">出发、无人值守运行到</w:t>
-      </w:r>
-      <w:r>
-        <w:rPr>
-          <w:rFonts w:ascii="Calibri" w:hAnsi="Calibri" w:eastAsia="微软雅黑"/>
-          <w:b/>
-          <w:i w:val="0"/>
-          <w:color w:val="000000"/>
-          <w:sz w:val="21"/>
-        </w:rPr>
-        <w:t xml:space="preserve">引用可核验的中文综述 PDF、结构化证据包和候选合成路线</w:t>
-      </w:r>
-      <w:r>
-        <w:rPr>
-          <w:rFonts w:ascii="Calibri" w:hAnsi="Calibri" w:eastAsia="微软雅黑"/>
-          <w:b w:val="0"/>
-          <w:i w:val="0"/>
-          <w:color w:val="000000"/>
-          <w:sz w:val="21"/>
-        </w:rPr>
-        <w:t xml:space="preserve">的多智能体系统。系统由三层组成：认知层是 9 个以 Markdown 写成的 agent 技能（编排、文献检索、风格学习、引用核验、分类法与写作、图纸、想法与实验方案、对抗审稿），由 Codex CLI 宿主执行；确定性层是 4 个可离线测试的 MCP server（在线五源检索与本地全文库、BibTeX 与作者顺序比对、figspec 图纸双渲染、无机逆合成预测）；控制层是账本驱动的回环（loopctl），九个出口闸门由代码而非模型自报判定"完成"。</w:t>
+        <w:t xml:space="preserve">SAGE-Mat 面向无机材料的文献调研与合成规划。研究者给出一个研究主题，系统依次完成文献检索、证据核验、综述写作和候选合成路线生成，输出中文综述、结构化证据包和可追溯的运行记录。系统分三层：认知层负责检索、写作、制图和实验构想；确定性工具层负责元数据核验、图纸渲染和前驱体预测；控制层用账本和九道流程闸门约束运行。任务是否完成由程序检查，不由模型自行判断。</w:t>
       </w:r>
     </w:p>
     <w:p>
       <w:pPr>
-        <w:spacing w:after="100" w:line="300" w:lineRule="auto"/>
-        <w:ind w:left="173" w:firstLine="0"/>
+        <w:spacing w:after="80" w:line="330" w:lineRule="auto"/>
+        <w:ind w:firstLine="420"/>
+        <w:jc w:val="both"/>
       </w:pPr>
       <w:r>
         <w:rPr>
@@ -189,12 +160,14 @@
           <w:color w:val="000000"/>
           <w:sz w:val="21"/>
         </w:rPr>
-        <w:t xml:space="preserve">复赛阶段在初赛方案基础上完成了三件事。第一，把初赛承诺的 LLZO 烧结致密化主题跑通为端到端诊断案例（46 篇核验文献、10 页综述、Top-5 前驱体路线），并据此修复了 11 类集成失效模式。第二，用纯主题冷启动完成正式案例 Ba5Y12Zn[O(SiO4)]8 及其结构近邻的合成条件调研：51 篇文献全部通过存在性、元数据与作者顺序三轴核验，正文 100 条结论、219 次引用、整合率 100%，两轮对抗审稿 0 blocker / 0 major，随后按材料专家 8 条意见完成学术化修订，形成 23 页正式报告。第三，将团队 NeurIPS 2026 投稿 RECIPE 的两阶段无机前驱体预测模型以 MCP 工具形式接入想法生成环节；模型 checkpoint、最小加载与预测代码和必备原料库随包提交，其在 2,558 条留出测试反应上的评测汇总（Combo@1 71.81、Combo@20 89.21、Combo MRR 77.48）随 checkpoint 一并提交，并以 CPU dry run 保证包内模型可加载、可预测。</w:t>
+        <w:t xml:space="preserve">复赛阶段完成了两个案例。LLZO 烧结致密化案例端到端跑通，得到 46 篇核验文献、10 页综述和 Top-5 前驱体路线，并据此修复了 11 类集成问题。正式案例以 Ba5Y12Zn[O(SiO4)]8 及其结构近邻为对象，从一行研究主题冷启动完成合成条件调研：51 篇文献全部通过存在性、元数据和作者顺序核验，正文含 100 条结论和 219 次引用，引用整合率 100%；两轮对抗审稿没有遗留 blocker 或 major 问题，随后按材料专家的 8 条意见修订为 23 页正式报告。此外，团队把 NeurIPS 2026 投稿工作 RECIPE 的两阶段无机前驱体预测模型接入系统，随包提交模型 checkpoint、最小加载与预测代码和必备原料库；模型在 2,558 条留出测试反应上的 Combo@1、Combo@20 和 Combo MRR 分别为 71.81、89.21 和 77.48，并通过 CPU dry run 确认可加载、可预测。</w:t>
       </w:r>
     </w:p>
     <w:p>
       <w:pPr>
         <w:pStyle w:val="3"/>
+        <w:keepNext/>
+        <w:keepLines/>
       </w:pPr>
       <w:r>
         <w:t>二、科学问题理解</w:t>
@@ -203,6 +176,8 @@
     <w:p>
       <w:pPr>
         <w:pStyle w:val="4"/>
+        <w:keepNext/>
+        <w:keepLines/>
       </w:pPr>
       <w:r>
         <w:t>2.1 科学问题与研究对象</w:t>
@@ -210,8 +185,9 @@
     </w:p>
     <w:p>
       <w:pPr>
-        <w:spacing w:after="100" w:line="300" w:lineRule="auto"/>
-        <w:ind w:left="173" w:firstLine="0"/>
+        <w:spacing w:after="80" w:line="330" w:lineRule="auto"/>
+        <w:ind w:firstLine="420"/>
+        <w:jc w:val="both"/>
       </w:pPr>
       <w:r>
         <w:rPr>
@@ -221,23 +197,14 @@
           <w:color w:val="000000"/>
           <w:sz w:val="21"/>
         </w:rPr>
-        <w:t xml:space="preserve">无机功能材料的合成知识分散在数万篇论文的实验部分，条件字段（原料与配比、温度—时间程序、气氛、坩埚与助熔剂、冷却方式、表征手段）以自然语言零散记录，且只有在实验语境一致时才能相互比较。对一个新报道或仅有单篇报道的化合物，研究者面临的核心问题是：</w:t>
-      </w:r>
-      <w:r>
-        <w:rPr>
-          <w:rFonts w:ascii="Calibri" w:hAnsi="Calibri" w:eastAsia="微软雅黑"/>
-          <w:b/>
-          <w:i w:val="0"/>
-          <w:color w:val="000000"/>
-          <w:sz w:val="21"/>
-        </w:rPr>
-        <w:t xml:space="preserve">已有文献能在多大程度上限定它的合成条件，哪些条件可以从结构相近体系迁移，哪些迁移是不成立的，以及下一步做什么实验最有科学发现价值。</w:t>
+        <w:t xml:space="preserve">无机功能材料的合成知识分散在大量论文的实验部分。原料与配比、温度—时间程序、气氛、坩埚与助熔剂、冷却方式和表征手段往往以自然语言零散记录，只有在实验语境一致时才能相互比较。面对新报道或仅有单篇报道的化合物，研究者需要判断：现有证据能把合成条件限定到什么程度，哪些条件可以从结构近邻迁移，哪些类比并不成立，以及下一步哪些实验最值得开展。</w:t>
       </w:r>
     </w:p>
     <w:p>
       <w:pPr>
-        <w:spacing w:after="100" w:line="300" w:lineRule="auto"/>
-        <w:ind w:left="173" w:firstLine="0"/>
+        <w:spacing w:after="80" w:line="330" w:lineRule="auto"/>
+        <w:ind w:firstLine="420"/>
+        <w:jc w:val="both"/>
       </w:pPr>
       <w:r>
         <w:rPr>
@@ -247,13 +214,14 @@
           <w:color w:val="000000"/>
           <w:sz w:val="21"/>
         </w:rPr>
-        <w:t xml:space="preserve">正式案例选择 Ba5Y12Zn[O(SiO4)]8（BYZSO），一种 2024 年首次报道的非中心对称硅酸盐。它在公开文献中只有一篇直接合成报道，且该报道未给出可独立复现的投料比、温程和冷却程序，是"文献稀缺、近邻丰富"的典型情形：Ba–Y–Si–O 四方谱系（如 Ba5Y13[SiO4]8O8.5、BaxY26Si16O71+x）、Ba–Zn–Si–O 结构端点（BaZnSiO4、Ba2ZnSi2O7、BaZnSi3O8）和 Y–Si–O 多型分别提供了助熔生长、固相成相和高温结构稳定性的可比证据。初赛案例 LLZO 石榴石固态电解质则代表"文献丰富但条件不可比"的另一极：低温致密化、两步烧结、冷烧结和超快烧结各有先例，却缺少跨掺杂体系的统一工艺图景。</w:t>
+        <w:t xml:space="preserve">正式案例选择 2024 年首次报道的非中心对称硅酸盐 Ba5Y12Zn[O(SiO4)]8（下称 BYZSO）。公开文献中只有一篇直接合成报道，且缺少可独立复现的投料比、温程和冷却程序，属于“直接证据少、近邻证据多”的情形。Ba–Y–Si–O 四方谱系（如 Ba5Y13[SiO4]8O8.5、BaxY26Si16O71+x）、Ba–Zn–Si–O 结构端点（BaZnSiO4、Ba2ZnSi2O7、BaZnSi3O8）和 Y–Si–O 多型，分别在助熔生长、固相成相和高温结构稳定性方面提供参照。初赛案例 LLZO 石榴石固态电解质则代表另一类问题：文献很多，但低温致密化、两步烧结、冷烧结和超快烧结之间缺少跨掺杂体系的统一工艺图景。</w:t>
       </w:r>
     </w:p>
     <w:p>
       <w:pPr>
-        <w:spacing w:after="100" w:line="300" w:lineRule="auto"/>
-        <w:ind w:left="173" w:firstLine="0"/>
+        <w:spacing w:after="80" w:line="330" w:lineRule="auto"/>
+        <w:ind w:firstLine="420"/>
+        <w:jc w:val="both"/>
       </w:pPr>
       <w:r>
         <w:rPr>
@@ -263,12 +231,14 @@
           <w:color w:val="000000"/>
           <w:sz w:val="21"/>
         </w:rPr>
-        <w:t xml:space="preserve">这一问题难在三处：关键词检索会混入综述、参考文献列表与跨体系讨论；"未检出"不等于"未研究"，别名与语料覆盖会制造假空白；温度、气氛、致密度与电导率等数值只有在实验语境一致时才能比较，误读一个升温节点或淬火温度就会产生虚假的规律或冲突。</w:t>
+        <w:t xml:space="preserve">这类问题的难点有三处。关键词检索容易混入综述、参考文献列表和跨体系讨论；“未检出”不等于“未研究”，别名和语料覆盖都可能造成假空白；温度、气氛、致密度和电导率等数值只有在实验语境一致时才可比较，误读一个升温节点或淬火温度就会得出虚假的规律或冲突。</w:t>
       </w:r>
     </w:p>
     <w:p>
       <w:pPr>
         <w:pStyle w:val="4"/>
+        <w:keepNext/>
+        <w:keepLines/>
       </w:pPr>
       <w:r>
         <w:t>2.2 科学意义</w:t>
@@ -276,8 +246,9 @@
     </w:p>
     <w:p>
       <w:pPr>
-        <w:spacing w:after="100" w:line="300" w:lineRule="auto"/>
-        <w:ind w:left="173" w:firstLine="0"/>
+        <w:spacing w:after="80" w:line="330" w:lineRule="auto"/>
+        <w:ind w:firstLine="420"/>
+        <w:jc w:val="both"/>
       </w:pPr>
       <w:r>
         <w:rPr>
@@ -287,33 +258,14 @@
           <w:color w:val="000000"/>
           <w:sz w:val="21"/>
         </w:rPr>
-        <w:t xml:space="preserve">对 BYZSO 这类新化合物，系统给出的不是一份"配方"，而是一张由文献证据限定的</w:t>
-      </w:r>
-      <w:r>
-        <w:rPr>
-          <w:rFonts w:ascii="Calibri" w:hAnsi="Calibri" w:eastAsia="微软雅黑"/>
-          <w:b/>
-          <w:i w:val="0"/>
-          <w:color w:val="000000"/>
-          <w:sz w:val="21"/>
-        </w:rPr>
-        <w:t xml:space="preserve">合成条件可迁移范围图</w:t>
-      </w:r>
-      <w:r>
-        <w:rPr>
-          <w:rFonts w:ascii="Calibri" w:hAnsi="Calibri" w:eastAsia="微软雅黑"/>
-          <w:b w:val="0"/>
-          <w:i w:val="0"/>
-          <w:color w:val="000000"/>
-          <w:sz w:val="21"/>
-        </w:rPr>
-        <w:t xml:space="preserve">：哪些字段有直接证据、哪些只能从近邻体系借用、哪些近邻条件明确不适用，以及以局部相图、Zn–Y–氧计量耦合、固相成相与高温溶液长晶并行、Mg/Co 类比为主线的四类可检验实验方向；每个方向都落到具体前驱体（由预测模型给出并标注"模型候选、待实验验证"）与工艺路线。对 LLZO，系统把"寻找新掺杂"转向"建立可验证的工艺窗口"，并给出模型与文献相互印证的 Top-1 前驱体路线。</w:t>
+        <w:t xml:space="preserve">对 BYZSO 这类新化合物，本项目不直接给出单一“配方”，而是按证据来源划定合成条件的可迁移范围：哪些字段有直接证据，哪些条件只能参考近邻体系，哪些类比不能成立。在此基础上，系统围绕局部相图、Zn–Y–O 计量耦合、固相成相与高温溶液长晶并行，以及 Mg/​Co 类比，提出四类可检验的实验方向，并给出前驱体和工艺建议。前驱体来自预测模型，一律标注为“模型候选，待实验验证”。对 LLZO，重点从“寻找新掺杂”转向“建立可验证的工艺窗口”，其 Top-1 前驱体路线同时得到模型和文献支持。</w:t>
       </w:r>
     </w:p>
     <w:p>
       <w:pPr>
-        <w:spacing w:after="100" w:line="300" w:lineRule="auto"/>
-        <w:ind w:left="173" w:firstLine="0"/>
+        <w:spacing w:after="80" w:line="330" w:lineRule="auto"/>
+        <w:ind w:firstLine="420"/>
+        <w:jc w:val="both"/>
       </w:pPr>
       <w:r>
         <w:rPr>
@@ -323,17 +275,14 @@
           <w:color w:val="000000"/>
           <w:sz w:val="21"/>
         </w:rPr>
-        <w:t xml:space="preserve">更一般地，本项目把文献驱动发现从"生成像论文的结论"改为"保存检索范围、原文证据、否决原因和验证方案的决策过程"：每条结论可追溯到引用键、DOI、核验记录和（有全文时的）原文段落，每张图有可编辑源文件，每个判定有账本记录。这使得材料研究者可以区分真正值得实验的问题、语料造成的假空白和条件不可比造成的假冲突。</w:t>
-      </w:r>
-    </w:p>
-    <w:p>
-      <w:r>
-        <w:br w:type="page"/>
+        <w:t xml:space="preserve">本项目的产出也不止于一篇形式完整的综述：检索范围、原文证据、否决原因和验证方案都被保留下来。每条结论可追溯到引用键、DOI、核验记录以及可获取的原文段落；每张图保留可编辑源文件；每个流程判定都有账本记录。研究者因此能区分值得实验的问题、语料造成的假空白和条件不可比造成的假冲突。</w:t>
       </w:r>
     </w:p>
     <w:p>
       <w:pPr>
         <w:pStyle w:val="3"/>
+        <w:keepNext/>
+        <w:keepLines/>
       </w:pPr>
       <w:r>
         <w:t>三、技术方案与预期方法路线</w:t>
@@ -342,6 +291,8 @@
     <w:p>
       <w:pPr>
         <w:pStyle w:val="4"/>
+        <w:keepNext/>
+        <w:keepLines/>
       </w:pPr>
       <w:r>
         <w:t>3.1 技术方案</w:t>
@@ -349,7 +300,8 @@
     </w:p>
     <w:p>
       <w:pPr>
-        <w:spacing w:before="80" w:after="40"/>
+        <w:spacing w:before="120" w:after="40"/>
+        <w:keepNext/>
         <w:jc w:val="center"/>
       </w:pPr>
       <w:r>
@@ -388,7 +340,7 @@
     </w:p>
     <w:p>
       <w:pPr>
-        <w:spacing w:before="20" w:after="160"/>
+        <w:spacing w:before="40" w:after="200"/>
         <w:jc w:val="center"/>
       </w:pPr>
       <w:r>
@@ -396,16 +348,17 @@
           <w:rFonts w:ascii="Calibri" w:hAnsi="Calibri" w:eastAsia="微软雅黑"/>
           <w:b w:val="0"/>
           <w:i w:val="0"/>
-          <w:color w:val="5A6573"/>
+          <w:color w:val="404040"/>
           <w:sz w:val="18"/>
         </w:rPr>
-        <w:t xml:space="preserve">图 1｜GoAI Research 流水线：发现（五源检索 + 引用核验）→ 生产（分类法、图纸、想法、写作并行）→ 质量回环（对抗审稿、账本闸门、返工路由）。本图由系统自身的 figspec 渲染器生成，同源输出 SVG 与 draw.io。</w:t>
+        <w:t xml:space="preserve">图 1　GoAI Research 流水线：发现阶段完成多源检索与引用核验；生产阶段并行生成分类法、图纸、实验构想和正文；质量回环通过对抗审稿、账本闸门与返工路由收敛。图件由 figspec 渲染器同源输出 SVG 与 draw.io。</w:t>
       </w:r>
     </w:p>
     <w:p>
       <w:pPr>
-        <w:spacing w:after="100" w:line="300" w:lineRule="auto"/>
-        <w:ind w:left="173" w:firstLine="0"/>
+        <w:spacing w:after="80" w:line="330" w:lineRule="auto"/>
+        <w:ind w:firstLine="420"/>
+        <w:jc w:val="both"/>
       </w:pPr>
       <w:r>
         <w:rPr>
@@ -415,23 +368,119 @@
           <w:color w:val="000000"/>
           <w:sz w:val="21"/>
         </w:rPr>
-        <w:t xml:space="preserve">系统采用"认知—确定性—控制"三层分离的设计。</w:t>
+        <w:t xml:space="preserve">系统采用认知层、确定性工具层和控制层相互分离的设计。</w:t>
       </w:r>
     </w:p>
     <w:p>
       <w:pPr>
-        <w:spacing w:after="100" w:line="300" w:lineRule="auto"/>
-        <w:ind w:left="173" w:firstLine="0"/>
+        <w:spacing w:after="80" w:line="330" w:lineRule="auto"/>
+        <w:ind w:firstLine="420"/>
+        <w:jc w:val="both"/>
       </w:pPr>
       <w:r>
         <w:rPr>
           <w:rFonts w:ascii="Calibri" w:hAnsi="Calibri" w:eastAsia="微软雅黑"/>
-          <w:b/>
+          <w:b w:val="0"/>
           <w:i w:val="0"/>
           <w:color w:val="000000"/>
           <w:sz w:val="21"/>
         </w:rPr>
-        <w:t xml:space="preserve">认知层：9 个 agent 技能。</w:t>
+        <w:t xml:space="preserve">认知层包含 9 个以 Markdown 描述的智能体技能。goai-orchestrator 读取账本并按阶段分派任务；goai-lit-search 执行 arXiv、OpenAlex、Crossref、Semantic Scholar 和 DBLP 五源检索、引文滚雪球与本地全文检索，并生成覆盖率报告；goai-style-bank 从 30 篇经典综述中归纳写作和制图规范；goai-ref-guard 对引用的一手元数据逐字段复核；goai-survey-writer 依次完成分类法、写作蓝图和分节 LaTeX，只使用已核验的引用键，并要求近邻体系、既有实验结论和具体合成建议分别写清；goai-figure-studio 与 goai-figure-editable 负责可编辑矢量图；goai-idea-forge 根据覆盖缺口、矛盾信号和组合空位提出方向，并调用逆合成工具；goai-reviewer 以独立上下文从领域、方法和编辑三个视角审稿，输出可回流到责任阶段的结构化问题。上述技能构成提交包中的提示词全集。</w:t>
+      </w:r>
+    </w:p>
+    <w:p>
+      <w:pPr>
+        <w:spacing w:after="80" w:line="330" w:lineRule="auto"/>
+        <w:ind w:firstLine="420"/>
+        <w:jc w:val="both"/>
+      </w:pPr>
+      <w:r>
+        <w:rPr>
+          <w:rFonts w:ascii="Calibri" w:hAnsi="Calibri" w:eastAsia="微软雅黑"/>
+          <w:b w:val="0"/>
+          <w:i w:val="0"/>
+          <w:color w:val="000000"/>
+          <w:sz w:val="21"/>
+        </w:rPr>
+        <w:t xml:space="preserve">确定性工具层包含 4 个 MCP 服务，共 25 个工具。goai-litsearch 负责在线检索、下载、入库、BibTeX 导出、覆盖率统计和本地全文查询；goai-refcheck 通过存在性、元数据和作者顺序三项检查核验文献；goai-figure 负责 figspec 校验、排版检查、SVG 与 mxGraph 双渲染及 SVG 到 draw.io 的转换；goai-retro 提供两阶段无机前驱体预测和实验方案生成。各工具均可离线测试，每次调用都写入 tool_​calls.jsonl。</w:t>
+      </w:r>
+    </w:p>
+    <w:p>
+      <w:pPr>
+        <w:spacing w:after="80" w:line="330" w:lineRule="auto"/>
+        <w:ind w:firstLine="420"/>
+        <w:jc w:val="both"/>
+      </w:pPr>
+      <w:r>
+        <w:rPr>
+          <w:rFonts w:ascii="Calibri" w:hAnsi="Calibri" w:eastAsia="微软雅黑"/>
+          <w:b w:val="0"/>
+          <w:i w:val="0"/>
+          <w:color w:val="000000"/>
+          <w:sz w:val="21"/>
+        </w:rPr>
+        <w:t xml:space="preserve">控制层以 ledger.json 为账本。范围确认、文献覆盖、风格库、引用完整性、分类法、图纸、稿件、想法审稿和终审九道闸门均由 loopctl 读写。只有全部闸门落账、无 FAIL、无未关闭的 blocker 或 major，且审稿 PASS 指向实际存在的审稿记录时，check-done 才返回 0。审稿人与执行者职责分离；同一问题连续三轮未收敛时转人工处理。</w:t>
+      </w:r>
+    </w:p>
+    <w:p>
+      <w:pPr>
+        <w:spacing w:after="80" w:line="330" w:lineRule="auto"/>
+        <w:ind w:firstLine="420"/>
+        <w:jc w:val="both"/>
+      </w:pPr>
+      <w:r>
+        <w:rPr>
+          <w:rFonts w:ascii="Calibri" w:hAnsi="Calibri" w:eastAsia="微软雅黑"/>
+          <w:b w:val="0"/>
+          <w:i w:val="0"/>
+          <w:color w:val="000000"/>
+          <w:sz w:val="21"/>
+        </w:rPr>
+        <w:t xml:space="preserve">逆合成部分接入团队投稿 NeurIPS 2026 的 RECIPE（Reranking Exact Candidate Inorganic Precursor Entries）。该方法把单步无机逆合成表述为变长前驱体集合的排序问题。第一阶段用 formula-token Transformer 对目标式与 798 种前驱体打分，得到 Top-30 高召回候选；经过与标签无关的化学兼容性过滤后，候选池限制为 15 种，枚举 2—5 元组合，典型情况下得到 4,928 个集合。第二阶段把目标条件化的集合 token 与 374 维集合描述子结合，描述元素覆盖、多余元素、共现和计量相容性，用 listwise 目标、强负样本间隔和元素覆盖辅助损失完成重排。工具返回 Top-K 完整集合、两阶段分数、候选池内概率和 checkpoint SHA-256。这些结果只能以“模型候选，待实验验证”（chemical_​route_​verified=false）的身份进入正文，随后还要补充文献证据并接受人工复核。</w:t>
+      </w:r>
+    </w:p>
+    <w:p>
+      <w:pPr>
+        <w:pStyle w:val="4"/>
+        <w:keepNext/>
+        <w:keepLines/>
+      </w:pPr>
+      <w:r>
+        <w:t>3.2 方法路线</w:t>
+      </w:r>
+    </w:p>
+    <w:p>
+      <w:pPr>
+        <w:spacing w:after="80" w:line="330" w:lineRule="auto"/>
+        <w:ind w:firstLine="420"/>
+        <w:jc w:val="both"/>
+      </w:pPr>
+      <w:r>
+        <w:rPr>
+          <w:rFonts w:ascii="Calibri" w:hAnsi="Calibri" w:eastAsia="微软雅黑"/>
+          <w:b w:val="0"/>
+          <w:i w:val="0"/>
+          <w:color w:val="000000"/>
+          <w:sz w:val="21"/>
+        </w:rPr>
+        <w:t xml:space="preserve">正式运行的人工输入只有一行：“调研 Ba5Y12Zn[O(SiO4)]8 及其结构相近化合物的合成条件”。顶层编排器通过 codex exec --json 无人值守启动，按账本状态依次推进以下步骤。</w:t>
+      </w:r>
+    </w:p>
+    <w:p>
+      <w:pPr>
+        <w:spacing w:after="80" w:line="330" w:lineRule="auto"/>
+        <w:ind w:left="480" w:hanging="480"/>
+        <w:jc w:val="both"/>
+      </w:pPr>
+      <w:r>
+        <w:rPr>
+          <w:rFonts w:ascii="Calibri" w:hAnsi="Calibri" w:eastAsia="微软雅黑"/>
+          <w:b w:val="0"/>
+          <w:i w:val="0"/>
+          <w:color w:val="000000"/>
+          <w:sz w:val="21"/>
+        </w:rPr>
+        <w:t xml:space="preserve">1. </w:t>
       </w:r>
       <w:r>
         <w:rPr>
@@ -441,23 +490,24 @@
           <w:color w:val="000000"/>
           <w:sz w:val="21"/>
         </w:rPr>
-        <w:t xml:space="preserve"> goai-orchestrator 读取账本状态并按阶段分派；goai-lit-search 做 arXiv / OpenAlex / Crossref / Semantic Scholar / DBLP 五源检索、引文滚雪球与本地全文库检索，并产出覆盖率报告；goai-style-bank 从 30 篇经典综述蒸馏写作与画图风格卡；goai-ref-guard 对每条引用重新抓取一手元数据并逐字段比对；goai-survey-writer 从分类法到蓝图到逐节 LaTeX，只允许引用已核验库中的键，并强制材料学术语（近邻体系单独成节、前人实验结论汇总、每个方向落到具体合成建议）；goai-figure-studio / goai-figure-editable 采用"先生成视觉参照、再测量重建为可编辑矢量"的图纸管线；goai-idea-forge 从覆盖缺口、矛盾信号与组合空位中挖掘方向并调用逆合成工具；goai-reviewer 以全新上下文做三视角（领域专家、方法严谨派、期刊编辑）对抗审稿，产出带目标阶段的结构化 issue。全部技能是纯 Markdown，构成提交的 Prompt 全集。</w:t>
+        <w:t xml:space="preserve">范围与对象核验：先把输入结构式作为待核对记号，检索规范化学式、空间群和原始报道；随后确定调研边界，报告篇幅为中文 8—12 页，“结构相近”仅按可验证的同构、同型或拓扑关系判断。</w:t>
       </w:r>
     </w:p>
     <w:p>
       <w:pPr>
-        <w:spacing w:after="100" w:line="300" w:lineRule="auto"/>
-        <w:ind w:left="173" w:firstLine="0"/>
+        <w:spacing w:after="80" w:line="330" w:lineRule="auto"/>
+        <w:ind w:left="480" w:hanging="480"/>
+        <w:jc w:val="both"/>
       </w:pPr>
       <w:r>
         <w:rPr>
           <w:rFonts w:ascii="Calibri" w:hAnsi="Calibri" w:eastAsia="微软雅黑"/>
-          <w:b/>
+          <w:b w:val="0"/>
           <w:i w:val="0"/>
           <w:color w:val="000000"/>
           <w:sz w:val="21"/>
         </w:rPr>
-        <w:t xml:space="preserve">确定性层：4 个 MCP server、25 个工具。</w:t>
+        <w:t xml:space="preserve">2. </w:t>
       </w:r>
       <w:r>
         <w:rPr>
@@ -467,23 +517,24 @@
           <w:color w:val="000000"/>
           <w:sz w:val="21"/>
         </w:rPr>
-        <w:t xml:space="preserve"> goai-litsearch（在线检索、下载、入库、BibTeX 导出、覆盖率、本地全文库 grep_local_corpus / read_local_document / lookup_local_doi）；goai-refcheck（verify_entry / verify_bib_file 三轴核验：存在性、元数据、作者顺序）；goai-figure（figspec 校验、排版 lint、SVG 与 mxGraph 双渲染、SVG→draw.io 逆向）；goai-retro（predict_precursor_routes 两阶段无机前驱体预测、make_experiment_plan）。所有工具可离线测试，且每次调用写入审计日志 tool_calls.jsonl。</w:t>
+        <w:t xml:space="preserve">检索与风格学习：围绕 8 个互不重叠的子主题开展五源检索、本地全文检索和引文滚雪球，共得到 63 条候选；同时建立写作风格库。</w:t>
       </w:r>
     </w:p>
     <w:p>
       <w:pPr>
-        <w:spacing w:after="100" w:line="300" w:lineRule="auto"/>
-        <w:ind w:left="173" w:firstLine="0"/>
+        <w:spacing w:after="80" w:line="330" w:lineRule="auto"/>
+        <w:ind w:left="480" w:hanging="480"/>
+        <w:jc w:val="both"/>
       </w:pPr>
       <w:r>
         <w:rPr>
           <w:rFonts w:ascii="Calibri" w:hAnsi="Calibri" w:eastAsia="微软雅黑"/>
-          <w:b/>
+          <w:b w:val="0"/>
           <w:i w:val="0"/>
           <w:color w:val="000000"/>
           <w:sz w:val="21"/>
         </w:rPr>
-        <w:t xml:space="preserve">控制层：账本驱动的回环。</w:t>
+        <w:t xml:space="preserve">3. </w:t>
       </w:r>
       <w:r>
         <w:rPr>
@@ -493,23 +544,24 @@
           <w:color w:val="000000"/>
           <w:sz w:val="21"/>
         </w:rPr>
-        <w:t xml:space="preserve"> 九个出口闸门（范围确认、文献覆盖、风格库、引用完整性、分类法、图纸、稿件、想法审稿、终审）记录在 ledger.json，只能通过 loopctl 读写；check-done 仅在全部闸门落账、无 FAIL、无 open blocker/major、且审稿 PASS 指向真实存在的 trace 文件时才退出 0。审稿人不改稿，执行者不自判；同一 issue 三轮未收敛则升级人工。</w:t>
+        <w:t xml:space="preserve">引用核验：52 条文献接受存在性、元数据和作者顺序检查，其中 5 条因作者名规范化问题被判为 MISMATCH。连续三轮未收敛后，流程按规则转入人工处理，删除不影响主体结论的背景文献，最终 51 条全部 PASS。</w:t>
       </w:r>
     </w:p>
     <w:p>
       <w:pPr>
-        <w:spacing w:after="100" w:line="300" w:lineRule="auto"/>
-        <w:ind w:left="173" w:firstLine="0"/>
+        <w:spacing w:after="80" w:line="330" w:lineRule="auto"/>
+        <w:ind w:left="480" w:hanging="480"/>
+        <w:jc w:val="both"/>
       </w:pPr>
       <w:r>
         <w:rPr>
           <w:rFonts w:ascii="Calibri" w:hAnsi="Calibri" w:eastAsia="微软雅黑"/>
-          <w:b/>
+          <w:b w:val="0"/>
           <w:i w:val="0"/>
           <w:color w:val="000000"/>
           <w:sz w:val="21"/>
         </w:rPr>
-        <w:t xml:space="preserve">逆合成预测的融入方式。</w:t>
+        <w:t xml:space="preserve">4. </w:t>
       </w:r>
       <w:r>
         <w:rPr>
@@ -519,17 +571,24 @@
           <w:color w:val="000000"/>
           <w:sz w:val="21"/>
         </w:rPr>
-        <w:t xml:space="preserve"> goai-retro 的内核是团队 NeurIPS 2026 投稿 RECIPE（Reranking Exact Candidate Inorganic Precursor Entries）。它把单步无机逆合成重新形式化为</w:t>
+        <w:t xml:space="preserve">分类法与贡献确认：把内容组织为“身份谱系与证据分级”“路线—变量—验证矩阵”和“失败边界与条件迁移”三条主线。</w:t>
       </w:r>
+    </w:p>
+    <w:p>
+      <w:pPr>
+        <w:spacing w:after="80" w:line="330" w:lineRule="auto"/>
+        <w:ind w:left="480" w:hanging="480"/>
+        <w:jc w:val="both"/>
+      </w:pPr>
       <w:r>
         <w:rPr>
           <w:rFonts w:ascii="Calibri" w:hAnsi="Calibri" w:eastAsia="微软雅黑"/>
-          <w:b/>
+          <w:b w:val="0"/>
           <w:i w:val="0"/>
           <w:color w:val="000000"/>
           <w:sz w:val="21"/>
         </w:rPr>
-        <w:t xml:space="preserve">变长前驱体集合的排序问题</w:t>
+        <w:t xml:space="preserve">5. </w:t>
       </w:r>
       <w:r>
         <w:rPr>
@@ -539,21 +598,14 @@
           <w:color w:val="000000"/>
           <w:sz w:val="21"/>
         </w:rPr>
-        <w:t xml:space="preserve">，分两阶段：Precursor Candidate Generator 用 formula-token Transformer 对目标式与 798 个前驱体打分，构成高召回候选池（Top-30）；经过标签无关的化学兼容性过滤（非挥发元素须为目标元素子集，pool 上限 15）后枚举 2–5 元组合（典型 4,928 个集合）；Complete-Set Reranker 以目标条件化的集合 token 与 374 维集合描述子（覆盖度、多余元素、共现、计量相容性）做 listwise 重排，并以最强负样本间隔与元素覆盖辅助损失训练。工具返回 Top-K 完整集合及 Stage-1 概率、Stage-2 分数、候选池内概率与 checkpoint SHA-256；skill 层硬性规定其输出只能以"模型候选、待实验验证"（chemical_route_verified=false）进入正文，并须经文献证据补全与审稿人复核。</w:t>
+        <w:t xml:space="preserve">图纸、写作与实验构想并行：3 张图先形成视觉参照，再按 figspec 重建并输出 SVG 和 draw.io；11 个章节逐节写作，每条结论绑定引用键；实验构想阶段分别对 Zn、Mg 和 Co 三个目标调用 predict_​precursor_​routes。</w:t>
       </w:r>
     </w:p>
     <w:p>
       <w:pPr>
-        <w:pStyle w:val="4"/>
-      </w:pPr>
-      <w:r>
-        <w:t>3.2 方法路线（实际实现）</w:t>
-      </w:r>
-    </w:p>
-    <w:p>
-      <w:pPr>
-        <w:spacing w:after="100" w:line="300" w:lineRule="auto"/>
-        <w:ind w:left="173" w:firstLine="0"/>
+        <w:spacing w:after="80" w:line="330" w:lineRule="auto"/>
+        <w:ind w:left="480" w:hanging="480"/>
+        <w:jc w:val="both"/>
       </w:pPr>
       <w:r>
         <w:rPr>
@@ -563,13 +615,24 @@
           <w:color w:val="000000"/>
           <w:sz w:val="21"/>
         </w:rPr>
-        <w:t xml:space="preserve">正式运行只有一个人类输入："调研主题：Ba5Y12Zn[O(SiO4)]8及其结构相近化合物的合成条件"。顶层编排器以 codex exec --json 无人值守启动，按账本状态机推进：</w:t>
+        <w:t xml:space="preserve">6. </w:t>
+      </w:r>
+      <w:r>
+        <w:rPr>
+          <w:rFonts w:ascii="Calibri" w:hAnsi="Calibri" w:eastAsia="微软雅黑"/>
+          <w:b w:val="0"/>
+          <w:i w:val="0"/>
+          <w:color w:val="000000"/>
+          <w:sz w:val="21"/>
+        </w:rPr>
+        <w:t xml:space="preserve">两轮对抗审稿：首轮发现 I5—I11 共 7 项问题，分别退回责任阶段修改；第二轮未检出 blocker、major 或 minor 问题。review_​pass 回执写入账本后，check-done 返回 0，得到 20 页 PDF。</w:t>
       </w:r>
     </w:p>
     <w:p>
       <w:pPr>
-        <w:spacing w:after="100" w:line="300" w:lineRule="auto"/>
-        <w:ind w:left="173" w:firstLine="0"/>
+        <w:spacing w:after="80" w:line="330" w:lineRule="auto"/>
+        <w:ind w:left="480" w:hanging="480"/>
+        <w:jc w:val="both"/>
       </w:pPr>
       <w:r>
         <w:rPr>
@@ -579,17 +642,7 @@
           <w:color w:val="000000"/>
           <w:sz w:val="21"/>
         </w:rPr>
-        <w:t xml:space="preserve">1. </w:t>
-      </w:r>
-      <w:r>
-        <w:rPr>
-          <w:rFonts w:ascii="Calibri" w:hAnsi="Calibri" w:eastAsia="微软雅黑"/>
-          <w:b/>
-          <w:i w:val="0"/>
-          <w:color w:val="000000"/>
-          <w:sz w:val="21"/>
-        </w:rPr>
-        <w:t xml:space="preserve">范围与身份核验</w:t>
+        <w:t xml:space="preserve">7. </w:t>
       </w:r>
       <w:r>
         <w:rPr>
@@ -599,261 +652,79 @@
           <w:color w:val="000000"/>
           <w:sz w:val="21"/>
         </w:rPr>
-        <w:t xml:space="preserve">：将结构式视为待核对记号，检索规范化学式、空间群与原始报道；自动确认范围草案（中文 8–12 页、只按可验证的同构/同型/拓扑关系判定"结构相近"）。</w:t>
+        <w:t xml:space="preserve">专家意见修订：团队按材料专家的 8 条意见完成三轮修改，包括改用规范论文语言、在引言中突出研究目标、单列同类体系、汇总既有实验结论、把研究方向落实到工艺和前驱体、重绘学术图件、补充行文路线图，以及仅在助熔或慢冷与单晶终点同时出现时把 Pt/​Au 坩埚视为晶体生长证据。随后新增 academic_​language_​guard 术语检查，形成 23 页正式稿。</w:t>
       </w:r>
     </w:p>
     <w:p>
       <w:pPr>
-        <w:spacing w:after="100" w:line="300" w:lineRule="auto"/>
-        <w:ind w:left="173" w:firstLine="0"/>
+        <w:pStyle w:val="4"/>
+        <w:keepNext/>
+        <w:keepLines/>
+      </w:pPr>
+      <w:r>
+        <w:t>3.3 数据来源、依赖工具与运行流程</w:t>
+      </w:r>
+    </w:p>
+    <w:p>
+      <w:pPr>
+        <w:spacing w:before="120" w:after="60"/>
+        <w:keepNext/>
+        <w:jc w:val="center"/>
       </w:pPr>
       <w:r>
         <w:rPr>
           <w:rFonts w:ascii="Calibri" w:hAnsi="Calibri" w:eastAsia="微软雅黑"/>
           <w:b w:val="0"/>
           <w:i w:val="0"/>
-          <w:color w:val="000000"/>
-          <w:sz w:val="21"/>
+          <w:color w:val="404040"/>
+          <w:sz w:val="18"/>
         </w:rPr>
-        <w:t xml:space="preserve">2. </w:t>
-      </w:r>
-      <w:r>
-        <w:rPr>
-          <w:rFonts w:ascii="Calibri" w:hAnsi="Calibri" w:eastAsia="微软雅黑"/>
-          <w:b/>
-          <w:i w:val="0"/>
-          <w:color w:val="000000"/>
-          <w:sz w:val="21"/>
-        </w:rPr>
-        <w:t xml:space="preserve">检索与风格学习并行</w:t>
-      </w:r>
-      <w:r>
-        <w:rPr>
-          <w:rFonts w:ascii="Calibri" w:hAnsi="Calibri" w:eastAsia="微软雅黑"/>
-          <w:b w:val="0"/>
-          <w:i w:val="0"/>
-          <w:color w:val="000000"/>
-          <w:sz w:val="21"/>
-        </w:rPr>
-        <w:t xml:space="preserve">：8 个 MECE 子主题、五源检索 + 本地全文库 + 滚雪球，得到 63 条候选；同时构建风格库。</w:t>
-      </w:r>
-    </w:p>
-    <w:p>
-      <w:pPr>
-        <w:spacing w:after="100" w:line="300" w:lineRule="auto"/>
-        <w:ind w:left="173" w:firstLine="0"/>
-      </w:pPr>
-      <w:r>
-        <w:rPr>
-          <w:rFonts w:ascii="Calibri" w:hAnsi="Calibri" w:eastAsia="微软雅黑"/>
-          <w:b w:val="0"/>
-          <w:i w:val="0"/>
-          <w:color w:val="000000"/>
-          <w:sz w:val="21"/>
-        </w:rPr>
-        <w:t xml:space="preserve">3. </w:t>
-      </w:r>
-      <w:r>
-        <w:rPr>
-          <w:rFonts w:ascii="Calibri" w:hAnsi="Calibri" w:eastAsia="微软雅黑"/>
-          <w:b/>
-          <w:i w:val="0"/>
-          <w:color w:val="000000"/>
-          <w:sz w:val="21"/>
-        </w:rPr>
-        <w:t xml:space="preserve">引用闸门</w:t>
-      </w:r>
-      <w:r>
-        <w:rPr>
-          <w:rFonts w:ascii="Calibri" w:hAnsi="Calibri" w:eastAsia="微软雅黑"/>
-          <w:b w:val="0"/>
-          <w:i w:val="0"/>
-          <w:color w:val="000000"/>
-          <w:sz w:val="21"/>
-        </w:rPr>
-        <w:t xml:space="preserve">：52 条经三轴核验，5 条因作者名规范化污染被判 MISMATCH，连续三轮未收敛后按规则升级人工停点，采纳"删除背景文献继续"，最终 51 条全部 PASS。</w:t>
-      </w:r>
-    </w:p>
-    <w:p>
-      <w:pPr>
-        <w:spacing w:after="100" w:line="300" w:lineRule="auto"/>
-        <w:ind w:left="173" w:firstLine="0"/>
-      </w:pPr>
-      <w:r>
-        <w:rPr>
-          <w:rFonts w:ascii="Calibri" w:hAnsi="Calibri" w:eastAsia="微软雅黑"/>
-          <w:b w:val="0"/>
-          <w:i w:val="0"/>
-          <w:color w:val="000000"/>
-          <w:sz w:val="21"/>
-        </w:rPr>
-        <w:t xml:space="preserve">4. </w:t>
-      </w:r>
-      <w:r>
-        <w:rPr>
-          <w:rFonts w:ascii="Calibri" w:hAnsi="Calibri" w:eastAsia="微软雅黑"/>
-          <w:b/>
-          <w:i w:val="0"/>
-          <w:color w:val="000000"/>
-          <w:sz w:val="21"/>
-        </w:rPr>
-        <w:t xml:space="preserve">分类法与贡献确认</w:t>
-      </w:r>
-      <w:r>
-        <w:rPr>
-          <w:rFonts w:ascii="Calibri" w:hAnsi="Calibri" w:eastAsia="微软雅黑"/>
-          <w:b w:val="0"/>
-          <w:i w:val="0"/>
-          <w:color w:val="000000"/>
-          <w:sz w:val="21"/>
-        </w:rPr>
-        <w:t xml:space="preserve">：形成"身份谱系与证据分级—路线—变量—验证矩阵—失败边界与迁移"三条主线。</w:t>
-      </w:r>
-    </w:p>
-    <w:p>
-      <w:pPr>
-        <w:spacing w:after="100" w:line="300" w:lineRule="auto"/>
-        <w:ind w:left="173" w:firstLine="0"/>
-      </w:pPr>
-      <w:r>
-        <w:rPr>
-          <w:rFonts w:ascii="Calibri" w:hAnsi="Calibri" w:eastAsia="微软雅黑"/>
-          <w:b w:val="0"/>
-          <w:i w:val="0"/>
-          <w:color w:val="000000"/>
-          <w:sz w:val="21"/>
-        </w:rPr>
-        <w:t xml:space="preserve">5. </w:t>
-      </w:r>
-      <w:r>
-        <w:rPr>
-          <w:rFonts w:ascii="Calibri" w:hAnsi="Calibri" w:eastAsia="微软雅黑"/>
-          <w:b/>
-          <w:i w:val="0"/>
-          <w:color w:val="000000"/>
-          <w:sz w:val="21"/>
-        </w:rPr>
-        <w:t xml:space="preserve">图纸、写作、想法三路并行</w:t>
-      </w:r>
-      <w:r>
-        <w:rPr>
-          <w:rFonts w:ascii="Calibri" w:hAnsi="Calibri" w:eastAsia="微软雅黑"/>
-          <w:b w:val="0"/>
-          <w:i w:val="0"/>
-          <w:color w:val="000000"/>
-          <w:sz w:val="21"/>
-        </w:rPr>
-        <w:t xml:space="preserve">：3 张图（先 AI 生成视觉参照，再重建为 figspec→SVG/draw.io）；11 个章节逐节写作，每句结论绑定引用键；想法环节对 Zn / Mg / Co 三个目标调用 predict_precursor_routes。</w:t>
-      </w:r>
-    </w:p>
-    <w:p>
-      <w:pPr>
-        <w:spacing w:after="100" w:line="300" w:lineRule="auto"/>
-        <w:ind w:left="173" w:firstLine="0"/>
-      </w:pPr>
-      <w:r>
-        <w:rPr>
-          <w:rFonts w:ascii="Calibri" w:hAnsi="Calibri" w:eastAsia="微软雅黑"/>
-          <w:b w:val="0"/>
-          <w:i w:val="0"/>
-          <w:color w:val="000000"/>
-          <w:sz w:val="21"/>
-        </w:rPr>
-        <w:t xml:space="preserve">6. </w:t>
-      </w:r>
-      <w:r>
-        <w:rPr>
-          <w:rFonts w:ascii="Calibri" w:hAnsi="Calibri" w:eastAsia="微软雅黑"/>
-          <w:b/>
-          <w:i w:val="0"/>
-          <w:color w:val="000000"/>
-          <w:sz w:val="21"/>
-        </w:rPr>
-        <w:t xml:space="preserve">两轮对抗审稿</w:t>
-      </w:r>
-      <w:r>
-        <w:rPr>
-          <w:rFonts w:ascii="Calibri" w:hAnsi="Calibri" w:eastAsia="微软雅黑"/>
-          <w:b w:val="0"/>
-          <w:i w:val="0"/>
-          <w:color w:val="000000"/>
-          <w:sz w:val="21"/>
-        </w:rPr>
-        <w:t xml:space="preserve">：首轮 I5–I11 共 7 项 issue 路由回属主阶段返工；第二轮 0 blocker / 0 major / 0 minor，review_pass 带回执落账，check-done 退出 0，输出 20 页 PDF。</w:t>
-      </w:r>
-    </w:p>
-    <w:p>
-      <w:pPr>
-        <w:spacing w:after="100" w:line="300" w:lineRule="auto"/>
-        <w:ind w:left="173" w:firstLine="0"/>
-      </w:pPr>
-      <w:r>
-        <w:rPr>
-          <w:rFonts w:ascii="Calibri" w:hAnsi="Calibri" w:eastAsia="微软雅黑"/>
-          <w:b w:val="0"/>
-          <w:i w:val="0"/>
-          <w:color w:val="000000"/>
-          <w:sz w:val="21"/>
-        </w:rPr>
-        <w:t xml:space="preserve">7. </w:t>
-      </w:r>
-      <w:r>
-        <w:rPr>
-          <w:rFonts w:ascii="Calibri" w:hAnsi="Calibri" w:eastAsia="微软雅黑"/>
-          <w:b/>
-          <w:i w:val="0"/>
-          <w:color w:val="000000"/>
-          <w:sz w:val="21"/>
-        </w:rPr>
-        <w:t xml:space="preserve">专家反馈修订</w:t>
-      </w:r>
-      <w:r>
-        <w:rPr>
-          <w:rFonts w:ascii="Calibri" w:hAnsi="Calibri" w:eastAsia="微软雅黑"/>
-          <w:b w:val="0"/>
-          <w:i w:val="0"/>
-          <w:color w:val="000000"/>
-          <w:sz w:val="21"/>
-        </w:rPr>
-        <w:t xml:space="preserve">：依据材料专家 8 条意见（正规论文语言、引言介绍研究目标而非流程、同类体系单独讨论、前人结论合集、方向落到工艺与前驱体、学术排版图、行文路线图、Pt/Au 坩埚只在助熔/慢冷/单晶终点同时存在时作为晶体生长证据）进行三轮修订，新增 academic_language_guard 术语闸门，得到 23 页正式稿。</w:t>
-      </w:r>
-    </w:p>
-    <w:p>
-      <w:pPr>
-        <w:pStyle w:val="4"/>
-      </w:pPr>
-      <w:r>
-        <w:t>3.3 数据来源、依赖工具与运行流程</w:t>
+        <w:t xml:space="preserve">表 1　数据来源、模型与依赖及其公开情况</w:t>
       </w:r>
     </w:p>
     <w:tbl>
       <w:tblPr>
         <w:tblW w:w="9878" w:type="dxa"/>
+        <w:jc w:val="center"/>
         <w:tblBorders>
-          <w:top w:val="single" w:sz="4" w:color="A6A6A6"/>
-          <w:left w:val="single" w:sz="4" w:color="A6A6A6"/>
-          <w:bottom w:val="single" w:sz="4" w:color="A6A6A6"/>
-          <w:right w:val="single" w:sz="4" w:color="A6A6A6"/>
-          <w:insideH w:val="single" w:sz="4" w:color="A6A6A6"/>
-          <w:insideV w:val="single" w:sz="4" w:color="A6A6A6"/>
+          <w:top w:val="single" w:sz="12" w:color="1F1F1F"/>
+          <w:left w:val="nil"/>
+          <w:right w:val="nil"/>
+          <w:bottom w:val="single" w:sz="12" w:color="1F1F1F"/>
+          <w:insideH w:val="single" w:sz="2" w:color="D0D0D0"/>
+          <w:insideV w:val="nil"/>
         </w:tblBorders>
         <w:tblLayout w:type="fixed"/>
+        <w:tblCellMar>
+          <w:top w:w="50" w:type="dxa"/>
+          <w:left w:w="80" w:type="dxa"/>
+          <w:bottom w:w="50" w:type="dxa"/>
+          <w:right w:w="80" w:type="dxa"/>
+        </w:tblCellMar>
       </w:tblPr>
       <w:tblGrid>
-        <w:gridCol w:w="827"/>
-        <w:gridCol w:w="5401"/>
-        <w:gridCol w:w="3650"/>
+        <w:gridCol w:w="1538"/>
+        <w:gridCol w:w="5116"/>
+        <w:gridCol w:w="3224"/>
       </w:tblGrid>
       <w:tr>
+        <w:trPr>
+          <w:cantSplit/>
+          <w:tblHeader/>
+        </w:trPr>
         <w:tc>
           <w:tcPr>
-            <w:tcW w:w="827" w:type="dxa"/>
-            <w:shd w:val="clear" w:fill="F4F6F9"/>
+            <w:tcW w:w="1538" w:type="dxa"/>
+            <w:shd w:val="clear" w:fill="F2F2F2"/>
+            <w:tcBorders>
+              <w:bottom w:val="single" w:sz="6" w:color="1F1F1F"/>
+            </w:tcBorders>
             <w:vAlign w:val="center"/>
           </w:tcPr>
           <w:p>
             <w:pPr>
-              <w:spacing w:before="30" w:after="30"/>
+              <w:spacing w:before="20" w:after="20" w:line="260" w:lineRule="auto"/>
+              <w:jc w:val="left"/>
             </w:pPr>
             <w:r>
               <w:rPr>
@@ -869,13 +740,17 @@
         </w:tc>
         <w:tc>
           <w:tcPr>
-            <w:tcW w:w="5401" w:type="dxa"/>
-            <w:shd w:val="clear" w:fill="F4F6F9"/>
+            <w:tcW w:w="5116" w:type="dxa"/>
+            <w:shd w:val="clear" w:fill="F2F2F2"/>
+            <w:tcBorders>
+              <w:bottom w:val="single" w:sz="6" w:color="1F1F1F"/>
+            </w:tcBorders>
             <w:vAlign w:val="center"/>
           </w:tcPr>
           <w:p>
             <w:pPr>
-              <w:spacing w:before="30" w:after="30"/>
+              <w:spacing w:before="20" w:after="20" w:line="260" w:lineRule="auto"/>
+              <w:jc w:val="left"/>
             </w:pPr>
             <w:r>
               <w:rPr>
@@ -891,13 +766,17 @@
         </w:tc>
         <w:tc>
           <w:tcPr>
-            <w:tcW w:w="3650" w:type="dxa"/>
-            <w:shd w:val="clear" w:fill="F4F6F9"/>
+            <w:tcW w:w="3224" w:type="dxa"/>
+            <w:shd w:val="clear" w:fill="F2F2F2"/>
+            <w:tcBorders>
+              <w:bottom w:val="single" w:sz="6" w:color="1F1F1F"/>
+            </w:tcBorders>
             <w:vAlign w:val="center"/>
           </w:tcPr>
           <w:p>
             <w:pPr>
-              <w:spacing w:before="30" w:after="30"/>
+              <w:spacing w:before="20" w:after="20" w:line="260" w:lineRule="auto"/>
+              <w:jc w:val="left"/>
             </w:pPr>
             <w:r>
               <w:rPr>
@@ -907,20 +786,24 @@
                 <w:color w:val="000000"/>
                 <w:sz w:val="18"/>
               </w:rPr>
-              <w:t xml:space="preserve">公开状态</w:t>
+              <w:t xml:space="preserve">公开情况</w:t>
             </w:r>
           </w:p>
         </w:tc>
       </w:tr>
       <w:tr>
+        <w:trPr>
+          <w:cantSplit/>
+        </w:trPr>
         <w:tc>
           <w:tcPr>
-            <w:tcW w:w="827" w:type="dxa"/>
+            <w:tcW w:w="1538" w:type="dxa"/>
             <w:vAlign w:val="center"/>
           </w:tcPr>
           <w:p>
             <w:pPr>
-              <w:spacing w:before="30" w:after="30"/>
+              <w:spacing w:before="20" w:after="20" w:line="260" w:lineRule="auto"/>
+              <w:jc w:val="left"/>
             </w:pPr>
             <w:r>
               <w:rPr>
@@ -936,12 +819,13 @@
         </w:tc>
         <w:tc>
           <w:tcPr>
-            <w:tcW w:w="5401" w:type="dxa"/>
+            <w:tcW w:w="5116" w:type="dxa"/>
             <w:vAlign w:val="center"/>
           </w:tcPr>
           <w:p>
             <w:pPr>
-              <w:spacing w:before="30" w:after="30"/>
+              <w:spacing w:before="20" w:after="20" w:line="260" w:lineRule="auto"/>
+              <w:jc w:val="left"/>
             </w:pPr>
             <w:r>
               <w:rPr>
@@ -951,18 +835,19 @@
                 <w:color w:val="000000"/>
                 <w:sz w:val="18"/>
               </w:rPr>
-              <w:t xml:space="preserve">Crossref、OpenAlex、arXiv、Semantic Scholar、DBLP（免密钥公开 API）</w:t>
+              <w:t xml:space="preserve">Crossref、OpenAlex、arXiv、Semantic Scholar、DBLP（无需密钥的公开 API）</w:t>
             </w:r>
           </w:p>
         </w:tc>
         <w:tc>
           <w:tcPr>
-            <w:tcW w:w="3650" w:type="dxa"/>
+            <w:tcW w:w="3224" w:type="dxa"/>
             <w:vAlign w:val="center"/>
           </w:tcPr>
           <w:p>
             <w:pPr>
-              <w:spacing w:before="30" w:after="30"/>
+              <w:spacing w:before="20" w:after="20" w:line="260" w:lineRule="auto"/>
+              <w:jc w:val="left"/>
             </w:pPr>
             <w:r>
               <w:rPr>
@@ -978,14 +863,18 @@
         </w:tc>
       </w:tr>
       <w:tr>
+        <w:trPr>
+          <w:cantSplit/>
+        </w:trPr>
         <w:tc>
           <w:tcPr>
-            <w:tcW w:w="827" w:type="dxa"/>
+            <w:tcW w:w="1538" w:type="dxa"/>
             <w:vAlign w:val="center"/>
           </w:tcPr>
           <w:p>
             <w:pPr>
-              <w:spacing w:before="30" w:after="30"/>
+              <w:spacing w:before="20" w:after="20" w:line="260" w:lineRule="auto"/>
+              <w:jc w:val="left"/>
             </w:pPr>
             <w:r>
               <w:rPr>
@@ -1001,12 +890,13 @@
         </w:tc>
         <w:tc>
           <w:tcPr>
-            <w:tcW w:w="5401" w:type="dxa"/>
+            <w:tcW w:w="5116" w:type="dxa"/>
             <w:vAlign w:val="center"/>
           </w:tcPr>
           <w:p>
             <w:pPr>
-              <w:spacing w:before="30" w:after="30"/>
+              <w:spacing w:before="20" w:after="20" w:line="260" w:lineRule="auto"/>
+              <w:jc w:val="left"/>
             </w:pPr>
             <w:r>
               <w:rPr>
@@ -1016,18 +906,19 @@
                 <w:color w:val="000000"/>
                 <w:sz w:val="18"/>
               </w:rPr>
-              <w:t xml:space="preserve">团队自建 Markdown 化全文库（约 3,760 万篇，1990s–2021，Parquet 分片 + DOI 索引）</w:t>
+              <w:t xml:space="preserve">团队自建 Markdown 全文库（约 3,760 万篇，1990 年代—2021 年，Parquet 分片及 DOI 索引）</w:t>
             </w:r>
           </w:p>
         </w:tc>
         <w:tc>
           <w:tcPr>
-            <w:tcW w:w="3650" w:type="dxa"/>
+            <w:tcW w:w="3224" w:type="dxa"/>
             <w:vAlign w:val="center"/>
           </w:tcPr>
           <w:p>
             <w:pPr>
-              <w:spacing w:before="30" w:after="30"/>
+              <w:spacing w:before="20" w:after="20" w:line="260" w:lineRule="auto"/>
+              <w:jc w:val="left"/>
             </w:pPr>
             <w:r>
               <w:rPr>
@@ -1037,20 +928,24 @@
                 <w:color w:val="000000"/>
                 <w:sz w:val="18"/>
               </w:rPr>
-              <w:t xml:space="preserve">私有；公开包只含正式报告被引 51 篇中的 21 篇全文（goai-compact-parquet-v1），其余 30 篇以 DOI 提供</w:t>
+              <w:t xml:space="preserve">不公开；复现包收录正式报告 51 篇被引文献中的 21 篇全文，其余 30 篇提供 DOI</w:t>
             </w:r>
           </w:p>
         </w:tc>
       </w:tr>
       <w:tr>
+        <w:trPr>
+          <w:cantSplit/>
+        </w:trPr>
         <w:tc>
           <w:tcPr>
-            <w:tcW w:w="827" w:type="dxa"/>
+            <w:tcW w:w="1538" w:type="dxa"/>
             <w:vAlign w:val="center"/>
           </w:tcPr>
           <w:p>
             <w:pPr>
-              <w:spacing w:before="30" w:after="30"/>
+              <w:spacing w:before="20" w:after="20" w:line="260" w:lineRule="auto"/>
+              <w:jc w:val="left"/>
             </w:pPr>
             <w:r>
               <w:rPr>
@@ -1066,12 +961,13 @@
         </w:tc>
         <w:tc>
           <w:tcPr>
-            <w:tcW w:w="5401" w:type="dxa"/>
+            <w:tcW w:w="5116" w:type="dxa"/>
             <w:vAlign w:val="center"/>
           </w:tcPr>
           <w:p>
             <w:pPr>
-              <w:spacing w:before="30" w:after="30"/>
+              <w:spacing w:before="20" w:after="20" w:line="260" w:lineRule="auto"/>
+              <w:jc w:val="left"/>
             </w:pPr>
             <w:r>
               <w:rPr>
@@ -1087,12 +983,13 @@
         </w:tc>
         <w:tc>
           <w:tcPr>
-            <w:tcW w:w="3650" w:type="dxa"/>
+            <w:tcW w:w="3224" w:type="dxa"/>
             <w:vAlign w:val="center"/>
           </w:tcPr>
           <w:p>
             <w:pPr>
-              <w:spacing w:before="30" w:after="30"/>
+              <w:spacing w:before="20" w:after="20" w:line="260" w:lineRule="auto"/>
+              <w:jc w:val="left"/>
             </w:pPr>
             <w:r>
               <w:rPr>
@@ -1102,20 +999,24 @@
                 <w:color w:val="000000"/>
                 <w:sz w:val="18"/>
               </w:rPr>
-              <w:t xml:space="preserve">随源基准公开；仓库含测试集与两份 checkpoint</w:t>
+              <w:t xml:space="preserve">原始基准已公开；仓库包含测试集和两个 checkpoint</w:t>
             </w:r>
           </w:p>
         </w:tc>
       </w:tr>
       <w:tr>
+        <w:trPr>
+          <w:cantSplit/>
+        </w:trPr>
         <w:tc>
           <w:tcPr>
-            <w:tcW w:w="827" w:type="dxa"/>
+            <w:tcW w:w="1538" w:type="dxa"/>
             <w:vAlign w:val="center"/>
           </w:tcPr>
           <w:p>
             <w:pPr>
-              <w:spacing w:before="30" w:after="30"/>
+              <w:spacing w:before="20" w:after="20" w:line="260" w:lineRule="auto"/>
+              <w:jc w:val="left"/>
             </w:pPr>
             <w:r>
               <w:rPr>
@@ -1125,18 +1026,19 @@
                 <w:color w:val="000000"/>
                 <w:sz w:val="18"/>
               </w:rPr>
-              <w:t xml:space="preserve">LLM 与 Harness</w:t>
+              <w:t xml:space="preserve">LLM 与运行框架</w:t>
             </w:r>
           </w:p>
         </w:tc>
         <w:tc>
           <w:tcPr>
-            <w:tcW w:w="5401" w:type="dxa"/>
+            <w:tcW w:w="5116" w:type="dxa"/>
             <w:vAlign w:val="center"/>
           </w:tcPr>
           <w:p>
             <w:pPr>
-              <w:spacing w:before="30" w:after="30"/>
+              <w:spacing w:before="20" w:after="20" w:line="260" w:lineRule="auto"/>
+              <w:jc w:val="left"/>
             </w:pPr>
             <w:r>
               <w:rPr>
@@ -1146,18 +1048,19 @@
                 <w:color w:val="000000"/>
                 <w:sz w:val="18"/>
               </w:rPr>
-              <w:t xml:space="preserve">Codex CLI 0.146.1，模型 gpt-5.6-sol，推理强度 xhigh；构筑与运行阶段轨迹分目录提交</w:t>
+              <w:t xml:space="preserve">Codex CLI 0.146.1，模型 gpt-5.6-sol，推理强度 xhigh；构建与运行轨迹分别提交</w:t>
             </w:r>
           </w:p>
         </w:tc>
         <w:tc>
           <w:tcPr>
-            <w:tcW w:w="3650" w:type="dxa"/>
+            <w:tcW w:w="3224" w:type="dxa"/>
             <w:vAlign w:val="center"/>
           </w:tcPr>
           <w:p>
             <w:pPr>
-              <w:spacing w:before="30" w:after="30"/>
+              <w:spacing w:before="20" w:after="20" w:line="260" w:lineRule="auto"/>
+              <w:jc w:val="left"/>
             </w:pPr>
             <w:r>
               <w:rPr>
@@ -1167,20 +1070,24 @@
                 <w:color w:val="000000"/>
                 <w:sz w:val="18"/>
               </w:rPr>
-              <w:t xml:space="preserve">声明于 SUBMISSION.md §2</w:t>
+              <w:t xml:space="preserve">见 SUBMISSION.md 第 2 节</w:t>
             </w:r>
           </w:p>
         </w:tc>
       </w:tr>
       <w:tr>
+        <w:trPr>
+          <w:cantSplit/>
+        </w:trPr>
         <w:tc>
           <w:tcPr>
-            <w:tcW w:w="827" w:type="dxa"/>
+            <w:tcW w:w="1538" w:type="dxa"/>
             <w:vAlign w:val="center"/>
           </w:tcPr>
           <w:p>
             <w:pPr>
-              <w:spacing w:before="30" w:after="30"/>
+              <w:spacing w:before="20" w:after="20" w:line="260" w:lineRule="auto"/>
+              <w:jc w:val="left"/>
             </w:pPr>
             <w:r>
               <w:rPr>
@@ -1196,12 +1103,13 @@
         </w:tc>
         <w:tc>
           <w:tcPr>
-            <w:tcW w:w="5401" w:type="dxa"/>
+            <w:tcW w:w="5116" w:type="dxa"/>
             <w:vAlign w:val="center"/>
           </w:tcPr>
           <w:p>
             <w:pPr>
-              <w:spacing w:before="30" w:after="30"/>
+              <w:spacing w:before="20" w:after="20" w:line="260" w:lineRule="auto"/>
+              <w:jc w:val="left"/>
             </w:pPr>
             <w:r>
               <w:rPr>
@@ -1211,18 +1119,19 @@
                 <w:color w:val="000000"/>
                 <w:sz w:val="18"/>
               </w:rPr>
-              <w:t xml:space="preserve">Python ≥ 3.10、FastMCP、httpx、DuckDB、PyTorch 2.7（预测模型）、pymatgen；TeX（xelatex + ctex 或 tectonic）；可选 draw.io CLI</w:t>
+              <w:t xml:space="preserve">Python ≥ 3.10、FastMCP、httpx、DuckDB、PyTorch 2.7、pymatgen；TeX（xelatex + ctex 或 tectonic）；draw.io CLI 可选</w:t>
             </w:r>
           </w:p>
         </w:tc>
         <w:tc>
           <w:tcPr>
-            <w:tcW w:w="3650" w:type="dxa"/>
+            <w:tcW w:w="3224" w:type="dxa"/>
             <w:vAlign w:val="center"/>
           </w:tcPr>
           <w:p>
             <w:pPr>
-              <w:spacing w:before="30" w:after="30"/>
+              <w:spacing w:before="20" w:after="20" w:line="260" w:lineRule="auto"/>
+              <w:jc w:val="left"/>
             </w:pPr>
             <w:r>
               <w:rPr>
@@ -1240,13 +1149,14 @@
     </w:tbl>
     <w:p>
       <w:pPr>
-        <w:spacing w:after="60"/>
+        <w:spacing w:before="0" w:after="120"/>
       </w:pPr>
     </w:p>
     <w:p>
       <w:pPr>
-        <w:spacing w:after="100" w:line="300" w:lineRule="auto"/>
-        <w:ind w:left="173" w:firstLine="0"/>
+        <w:spacing w:after="80" w:line="330" w:lineRule="auto"/>
+        <w:ind w:firstLine="420"/>
+        <w:jc w:val="both"/>
       </w:pPr>
       <w:r>
         <w:rPr>
@@ -1256,12 +1166,14 @@
           <w:color w:val="000000"/>
           <w:sz w:val="21"/>
         </w:rPr>
-        <w:t xml:space="preserve">运行流程：bash install.sh --retro → bash scripts/smoke_test.sh --with-retro（无网络、无 LLM，1–2 分钟）→ bash scripts/reproduce_core.sh [--topic …]（需 Codex 登录、网络、TeX）。</w:t>
+        <w:t xml:space="preserve">运行流程为：bash install.sh --retro 安装；bash scripts/​smoke_​test.sh --with-retro 做无网络、无 LLM 的冒烟测试（1—2 分钟）；bash scripts/​reproduce_​core.sh [--topic …] 重跑完整流程（需 Codex 登录、网络和 TeX）。</w:t>
       </w:r>
     </w:p>
     <w:p>
       <w:pPr>
         <w:pStyle w:val="3"/>
+        <w:keepNext/>
+        <w:keepLines/>
       </w:pPr>
       <w:r>
         <w:t>四、实验结果</w:t>
@@ -1270,6 +1182,8 @@
     <w:p>
       <w:pPr>
         <w:pStyle w:val="4"/>
+        <w:keepNext/>
+        <w:keepLines/>
       </w:pPr>
       <w:r>
         <w:t>4.1 实验设置</w:t>
@@ -1277,8 +1191,9 @@
     </w:p>
     <w:p>
       <w:pPr>
-        <w:spacing w:after="100" w:line="300" w:lineRule="auto"/>
-        <w:ind w:left="173" w:firstLine="0"/>
+        <w:spacing w:after="80" w:line="330" w:lineRule="auto"/>
+        <w:ind w:firstLine="420"/>
+        <w:jc w:val="both"/>
       </w:pPr>
       <w:r>
         <w:rPr>
@@ -1288,73 +1203,14 @@
           <w:color w:val="000000"/>
           <w:sz w:val="21"/>
         </w:rPr>
-        <w:t xml:space="preserve">两个案例、一个基准。</w:t>
-      </w:r>
-      <w:r>
-        <w:rPr>
-          <w:rFonts w:ascii="Calibri" w:hAnsi="Calibri" w:eastAsia="微软雅黑"/>
-          <w:b/>
-          <w:i w:val="0"/>
-          <w:color w:val="000000"/>
-          <w:sz w:val="21"/>
-        </w:rPr>
-        <w:t xml:space="preserve">案例 A（正式）</w:t>
-      </w:r>
-      <w:r>
-        <w:rPr>
-          <w:rFonts w:ascii="Calibri" w:hAnsi="Calibri" w:eastAsia="微软雅黑"/>
-          <w:b w:val="0"/>
-          <w:i w:val="0"/>
-          <w:color w:val="000000"/>
-          <w:sz w:val="21"/>
-        </w:rPr>
-        <w:t xml:space="preserve">：BYZSO 纯主题冷启动，2026-08-31 至 09-01 完成，09-02 专家反馈修订；顶层编排器 5 次调用（首轮 + 4 个人工停点续跑），29 批 / 40 个子任务，约 7,084 万输入 token、56.7 万输出 token，224 次工具函数调用、205 次内置网页搜索、134 条服务端审计的全文库与预测调用。</w:t>
-      </w:r>
-      <w:r>
-        <w:rPr>
-          <w:rFonts w:ascii="Calibri" w:hAnsi="Calibri" w:eastAsia="微软雅黑"/>
-          <w:b/>
-          <w:i w:val="0"/>
-          <w:color w:val="000000"/>
-          <w:sz w:val="21"/>
-        </w:rPr>
-        <w:t xml:space="preserve">案例 B（初赛承诺）</w:t>
-      </w:r>
-      <w:r>
-        <w:rPr>
-          <w:rFonts w:ascii="Calibri" w:hAnsi="Calibri" w:eastAsia="微软雅黑"/>
-          <w:b w:val="0"/>
-          <w:i w:val="0"/>
-          <w:color w:val="000000"/>
-          <w:sz w:val="21"/>
-        </w:rPr>
-        <w:t xml:space="preserve">：LLZO 烧结致密化诊断轮，2026-08-29，21 个任务、49 次 MCP 调用。</w:t>
-      </w:r>
-      <w:r>
-        <w:rPr>
-          <w:rFonts w:ascii="Calibri" w:hAnsi="Calibri" w:eastAsia="微软雅黑"/>
-          <w:b/>
-          <w:i w:val="0"/>
-          <w:color w:val="000000"/>
-          <w:sz w:val="21"/>
-        </w:rPr>
-        <w:t xml:space="preserve">基准</w:t>
-      </w:r>
-      <w:r>
-        <w:rPr>
-          <w:rFonts w:ascii="Calibri" w:hAnsi="Calibri" w:eastAsia="微软雅黑"/>
-          <w:b w:val="0"/>
-          <w:i w:val="0"/>
-          <w:color w:val="000000"/>
-          <w:sz w:val="21"/>
-        </w:rPr>
-        <w:t xml:space="preserve">：RECIPE 两阶段模型在 Retro 留出测试集（2,558 条，2018 年后反应）上的评测汇总，随 checkpoint 提交（stage1_summary.json / stage2_summary.json，单种子 20260504），协议与论文一致（top_m 30、pool 15、集合大小 2–5、全分母）。</w:t>
+        <w:t xml:space="preserve">评测由两个案例和一个模型基准组成。正式案例 A 为 BYZSO 主题冷启动，2026 年 8 月 31 日至 9 月 1 日完成，9 月 2 日按专家意见修订；顶层编排器共调用 5 次（首轮运行及 4 个人工停点续跑），包含 29 批 40 个子任务，约 7,084 万输入 token 和 56.7 万输出 token，记录 223 次工具函数调用、205 次内置网页搜索，以及 134 条服务端审计的全文库与预测调用。案例 B 为 2026 年 8 月 29 日完成的 LLZO 烧结致密化诊断轮，包含 21 个任务和 49 次 MCP 调用。模型基准采用 RECIPE 在 Retro 留出测试集上的结果，共 2,558 条 2018 年后的反应；评测使用单一种子 20260504，参数为 top_​m=30、pool=15、集合大小 2—5，并按全部测试样本计算。</w:t>
       </w:r>
     </w:p>
     <w:p>
       <w:pPr>
-        <w:spacing w:after="100" w:line="300" w:lineRule="auto"/>
-        <w:ind w:left="173" w:firstLine="0"/>
+        <w:spacing w:after="80" w:line="330" w:lineRule="auto"/>
+        <w:ind w:firstLine="420"/>
+        <w:jc w:val="both"/>
       </w:pPr>
       <w:r>
         <w:rPr>
@@ -1364,12 +1220,14 @@
           <w:color w:val="000000"/>
           <w:sz w:val="21"/>
         </w:rPr>
-        <w:t xml:space="preserve">复赛期间共 7 组运行全部留痕（含一次停在文献阶段的失败冷启动），正式结果取"最后一个同时通过 bib_guard、tex_guard、academic_language_guard 与 review_pass 的版本"，不在多次运行间挑选；详细清单见 SUBMISSION.md §3。</w:t>
+        <w:t xml:space="preserve">复赛期间共记录 8 组运行，其中包括一次停在文献阶段的失败冷启动，以及 9 月 3 日用同一系统对三个新主题各做一次的冷启动（LLZO 石榴石电解质、BaZn2Si2O7 近邻体系、Ba–Y–Zn–Si–O 相图导向合成，作为补充案例随包提交）。正式结果取最后一个同时通过 bib_​guard、tex_​guard、academic_​language_​guard 和 review_​pass 的版本，不在多次运行结果中择优；完整清单见 SUBMISSION.md 第 3 节。</w:t>
       </w:r>
     </w:p>
     <w:p>
       <w:pPr>
         <w:pStyle w:val="4"/>
+        <w:keepNext/>
+        <w:keepLines/>
       </w:pPr>
       <w:r>
         <w:t>4.2 案例 A：Ba5Y12Zn[O(SiO4)]8 合成条件调研</w:t>
@@ -1377,7 +1235,8 @@
     </w:p>
     <w:p>
       <w:pPr>
-        <w:spacing w:before="80" w:after="40"/>
+        <w:spacing w:before="120" w:after="40"/>
+        <w:keepNext/>
         <w:jc w:val="center"/>
       </w:pPr>
       <w:r>
@@ -1416,7 +1275,7 @@
     </w:p>
     <w:p>
       <w:pPr>
-        <w:spacing w:before="20" w:after="160"/>
+        <w:spacing w:before="40" w:after="200"/>
         <w:jc w:val="center"/>
       </w:pPr>
       <w:r>
@@ -1424,39 +1283,71 @@
           <w:rFonts w:ascii="Calibri" w:hAnsi="Calibri" w:eastAsia="微软雅黑"/>
           <w:b w:val="0"/>
           <w:i w:val="0"/>
-          <w:color w:val="5A6573"/>
+          <w:color w:val="404040"/>
           <w:sz w:val="18"/>
         </w:rPr>
-        <w:t xml:space="preserve">图 2｜正式报告的研究路线图（第三轮学术化重绘）：从 Ba–Y–Si–O 近邻的组成空间与局部候选区，经候选晶相与两条合成路径（固相成相、高温溶液长晶），到粉末衍射、单晶结构与实际化学计量的互补表征反馈。</w:t>
+        <w:t xml:space="preserve">图 2　正式报告的研究路线：从 Ba–Y–Si–O 近邻的组成空间和局部候选区出发，沿固相成相与高温溶液长晶两条路径获得候选晶相，再以粉末衍射、单晶结构和实际化学计量的互补表征结果反馈修正。</w:t>
+      </w:r>
+    </w:p>
+    <w:p>
+      <w:pPr>
+        <w:spacing w:before="120" w:after="60"/>
+        <w:keepNext/>
+        <w:jc w:val="center"/>
+      </w:pPr>
+      <w:r>
+        <w:rPr>
+          <w:rFonts w:ascii="Calibri" w:hAnsi="Calibri" w:eastAsia="微软雅黑"/>
+          <w:b w:val="0"/>
+          <w:i w:val="0"/>
+          <w:color w:val="404040"/>
+          <w:sz w:val="18"/>
+        </w:rPr>
+        <w:t xml:space="preserve">表 2　案例 A 的产出与核验指标</w:t>
       </w:r>
     </w:p>
     <w:tbl>
       <w:tblPr>
         <w:tblW w:w="9878" w:type="dxa"/>
+        <w:jc w:val="center"/>
         <w:tblBorders>
-          <w:top w:val="single" w:sz="4" w:color="A6A6A6"/>
-          <w:left w:val="single" w:sz="4" w:color="A6A6A6"/>
-          <w:bottom w:val="single" w:sz="4" w:color="A6A6A6"/>
-          <w:right w:val="single" w:sz="4" w:color="A6A6A6"/>
-          <w:insideH w:val="single" w:sz="4" w:color="A6A6A6"/>
-          <w:insideV w:val="single" w:sz="4" w:color="A6A6A6"/>
+          <w:top w:val="single" w:sz="12" w:color="1F1F1F"/>
+          <w:left w:val="nil"/>
+          <w:right w:val="nil"/>
+          <w:bottom w:val="single" w:sz="12" w:color="1F1F1F"/>
+          <w:insideH w:val="single" w:sz="2" w:color="D0D0D0"/>
+          <w:insideV w:val="nil"/>
         </w:tblBorders>
         <w:tblLayout w:type="fixed"/>
+        <w:tblCellMar>
+          <w:top w:w="50" w:type="dxa"/>
+          <w:left w:w="80" w:type="dxa"/>
+          <w:bottom w:w="50" w:type="dxa"/>
+          <w:right w:w="80" w:type="dxa"/>
+        </w:tblCellMar>
       </w:tblPr>
       <w:tblGrid>
-        <w:gridCol w:w="609"/>
-        <w:gridCol w:w="9269"/>
+        <w:gridCol w:w="1120"/>
+        <w:gridCol w:w="8758"/>
       </w:tblGrid>
       <w:tr>
+        <w:trPr>
+          <w:cantSplit/>
+          <w:tblHeader/>
+        </w:trPr>
         <w:tc>
           <w:tcPr>
-            <w:tcW w:w="609" w:type="dxa"/>
-            <w:shd w:val="clear" w:fill="F4F6F9"/>
+            <w:tcW w:w="1120" w:type="dxa"/>
+            <w:shd w:val="clear" w:fill="F2F2F2"/>
+            <w:tcBorders>
+              <w:bottom w:val="single" w:sz="6" w:color="1F1F1F"/>
+            </w:tcBorders>
             <w:vAlign w:val="center"/>
           </w:tcPr>
           <w:p>
             <w:pPr>
-              <w:spacing w:before="30" w:after="30"/>
+              <w:spacing w:before="20" w:after="20" w:line="260" w:lineRule="auto"/>
+              <w:jc w:val="left"/>
             </w:pPr>
             <w:r>
               <w:rPr>
@@ -1472,13 +1363,17 @@
         </w:tc>
         <w:tc>
           <w:tcPr>
-            <w:tcW w:w="9269" w:type="dxa"/>
-            <w:shd w:val="clear" w:fill="F4F6F9"/>
+            <w:tcW w:w="8758" w:type="dxa"/>
+            <w:shd w:val="clear" w:fill="F2F2F2"/>
+            <w:tcBorders>
+              <w:bottom w:val="single" w:sz="6" w:color="1F1F1F"/>
+            </w:tcBorders>
             <w:vAlign w:val="center"/>
           </w:tcPr>
           <w:p>
             <w:pPr>
-              <w:spacing w:before="30" w:after="30"/>
+              <w:spacing w:before="20" w:after="20" w:line="260" w:lineRule="auto"/>
+              <w:jc w:val="left"/>
             </w:pPr>
             <w:r>
               <w:rPr>
@@ -1494,14 +1389,18 @@
         </w:tc>
       </w:tr>
       <w:tr>
+        <w:trPr>
+          <w:cantSplit/>
+        </w:trPr>
         <w:tc>
           <w:tcPr>
-            <w:tcW w:w="609" w:type="dxa"/>
+            <w:tcW w:w="1120" w:type="dxa"/>
             <w:vAlign w:val="center"/>
           </w:tcPr>
           <w:p>
             <w:pPr>
-              <w:spacing w:before="30" w:after="30"/>
+              <w:spacing w:before="20" w:after="20" w:line="260" w:lineRule="auto"/>
+              <w:jc w:val="left"/>
             </w:pPr>
             <w:r>
               <w:rPr>
@@ -1517,12 +1416,13 @@
         </w:tc>
         <w:tc>
           <w:tcPr>
-            <w:tcW w:w="9269" w:type="dxa"/>
+            <w:tcW w:w="8758" w:type="dxa"/>
             <w:vAlign w:val="center"/>
           </w:tcPr>
           <w:p>
             <w:pPr>
-              <w:spacing w:before="30" w:after="30"/>
+              <w:spacing w:before="20" w:after="20" w:line="260" w:lineRule="auto"/>
+              <w:jc w:val="left"/>
             </w:pPr>
             <w:r>
               <w:rPr>
@@ -1532,20 +1432,24 @@
                 <w:color w:val="000000"/>
                 <w:sz w:val="18"/>
               </w:rPr>
-              <w:t xml:space="preserve">63 条候选 → 51 条入库，三轴核验 51/51 PASS</w:t>
+              <w:t xml:space="preserve">63 条候选 → 51 条入库，三项核验 51/​51 PASS</w:t>
             </w:r>
           </w:p>
         </w:tc>
       </w:tr>
       <w:tr>
+        <w:trPr>
+          <w:cantSplit/>
+        </w:trPr>
         <w:tc>
           <w:tcPr>
-            <w:tcW w:w="609" w:type="dxa"/>
+            <w:tcW w:w="1120" w:type="dxa"/>
             <w:vAlign w:val="center"/>
           </w:tcPr>
           <w:p>
             <w:pPr>
-              <w:spacing w:before="30" w:after="30"/>
+              <w:spacing w:before="20" w:after="20" w:line="260" w:lineRule="auto"/>
+              <w:jc w:val="left"/>
             </w:pPr>
             <w:r>
               <w:rPr>
@@ -1561,12 +1465,13 @@
         </w:tc>
         <w:tc>
           <w:tcPr>
-            <w:tcW w:w="9269" w:type="dxa"/>
+            <w:tcW w:w="8758" w:type="dxa"/>
             <w:vAlign w:val="center"/>
           </w:tcPr>
           <w:p>
             <w:pPr>
-              <w:spacing w:before="30" w:after="30"/>
+              <w:spacing w:before="20" w:after="20" w:line="260" w:lineRule="auto"/>
+              <w:jc w:val="left"/>
             </w:pPr>
             <w:r>
               <w:rPr>
@@ -1582,14 +1487,18 @@
         </w:tc>
       </w:tr>
       <w:tr>
+        <w:trPr>
+          <w:cantSplit/>
+        </w:trPr>
         <w:tc>
           <w:tcPr>
-            <w:tcW w:w="609" w:type="dxa"/>
+            <w:tcW w:w="1120" w:type="dxa"/>
             <w:vAlign w:val="center"/>
           </w:tcPr>
           <w:p>
             <w:pPr>
-              <w:spacing w:before="30" w:after="30"/>
+              <w:spacing w:before="20" w:after="20" w:line="260" w:lineRule="auto"/>
+              <w:jc w:val="left"/>
             </w:pPr>
             <w:r>
               <w:rPr>
@@ -1605,12 +1514,13 @@
         </w:tc>
         <w:tc>
           <w:tcPr>
-            <w:tcW w:w="9269" w:type="dxa"/>
+            <w:tcW w:w="8758" w:type="dxa"/>
             <w:vAlign w:val="center"/>
           </w:tcPr>
           <w:p>
             <w:pPr>
-              <w:spacing w:before="30" w:after="30"/>
+              <w:spacing w:before="20" w:after="20" w:line="260" w:lineRule="auto"/>
+              <w:jc w:val="left"/>
             </w:pPr>
             <w:r>
               <w:rPr>
@@ -1620,20 +1530,24 @@
                 <w:color w:val="000000"/>
                 <w:sz w:val="18"/>
               </w:rPr>
-              <w:t xml:space="preserve">54 条结论有包内全文可回读；36 条合成条件结论带原文页/节定位（B1、B5、B6、C6、C17 等单元格逐字段区分"可支持"与"不可支持"）</w:t>
+              <w:t xml:space="preserve">54 条结论可从包内全文回读；36 条合成条件结论带原文页码或章节定位，并逐字段区分“可支持”与“不可支持”</w:t>
             </w:r>
           </w:p>
         </w:tc>
       </w:tr>
       <w:tr>
+        <w:trPr>
+          <w:cantSplit/>
+        </w:trPr>
         <w:tc>
           <w:tcPr>
-            <w:tcW w:w="609" w:type="dxa"/>
+            <w:tcW w:w="1120" w:type="dxa"/>
             <w:vAlign w:val="center"/>
           </w:tcPr>
           <w:p>
             <w:pPr>
-              <w:spacing w:before="30" w:after="30"/>
+              <w:spacing w:before="20" w:after="20" w:line="260" w:lineRule="auto"/>
+              <w:jc w:val="left"/>
             </w:pPr>
             <w:r>
               <w:rPr>
@@ -1649,12 +1563,13 @@
         </w:tc>
         <w:tc>
           <w:tcPr>
-            <w:tcW w:w="9269" w:type="dxa"/>
+            <w:tcW w:w="8758" w:type="dxa"/>
             <w:vAlign w:val="center"/>
           </w:tcPr>
           <w:p>
             <w:pPr>
-              <w:spacing w:before="30" w:after="30"/>
+              <w:spacing w:before="20" w:after="20" w:line="260" w:lineRule="auto"/>
+              <w:jc w:val="left"/>
             </w:pPr>
             <w:r>
               <w:rPr>
@@ -1664,20 +1579,24 @@
                 <w:color w:val="000000"/>
                 <w:sz w:val="18"/>
               </w:rPr>
-              <w:t xml:space="preserve">3 张，figspec → SVG + draw.io 同源，均通过排版 lint</w:t>
+              <w:t xml:space="preserve">3 张，figspec 同源输出 SVG 与 draw.io，均通过排版检查</w:t>
             </w:r>
           </w:p>
         </w:tc>
       </w:tr>
       <w:tr>
+        <w:trPr>
+          <w:cantSplit/>
+        </w:trPr>
         <w:tc>
           <w:tcPr>
-            <w:tcW w:w="609" w:type="dxa"/>
+            <w:tcW w:w="1120" w:type="dxa"/>
             <w:vAlign w:val="center"/>
           </w:tcPr>
           <w:p>
             <w:pPr>
-              <w:spacing w:before="30" w:after="30"/>
+              <w:spacing w:before="20" w:after="20" w:line="260" w:lineRule="auto"/>
+              <w:jc w:val="left"/>
             </w:pPr>
             <w:r>
               <w:rPr>
@@ -1693,12 +1612,13 @@
         </w:tc>
         <w:tc>
           <w:tcPr>
-            <w:tcW w:w="9269" w:type="dxa"/>
+            <w:tcW w:w="8758" w:type="dxa"/>
             <w:vAlign w:val="center"/>
           </w:tcPr>
           <w:p>
             <w:pPr>
-              <w:spacing w:before="30" w:after="30"/>
+              <w:spacing w:before="20" w:after="20" w:line="260" w:lineRule="auto"/>
+              <w:jc w:val="left"/>
             </w:pPr>
             <w:r>
               <w:rPr>
@@ -1708,20 +1628,24 @@
                 <w:color w:val="000000"/>
                 <w:sz w:val="18"/>
               </w:rPr>
-              <w:t xml:space="preserve">两轮，最终 0 blocker / 0 major / 0 minor（同家族冷启动复审，provisional=true）</w:t>
+              <w:t xml:space="preserve">两轮，最终 0 blocker / 0 major / 0 minor（同系列模型冷启动复审，provisional=true）</w:t>
             </w:r>
           </w:p>
         </w:tc>
       </w:tr>
       <w:tr>
+        <w:trPr>
+          <w:cantSplit/>
+        </w:trPr>
         <w:tc>
           <w:tcPr>
-            <w:tcW w:w="609" w:type="dxa"/>
+            <w:tcW w:w="1120" w:type="dxa"/>
             <w:vAlign w:val="center"/>
           </w:tcPr>
           <w:p>
             <w:pPr>
-              <w:spacing w:before="30" w:after="30"/>
+              <w:spacing w:before="20" w:after="20" w:line="260" w:lineRule="auto"/>
+              <w:jc w:val="left"/>
             </w:pPr>
             <w:r>
               <w:rPr>
@@ -1737,12 +1661,13 @@
         </w:tc>
         <w:tc>
           <w:tcPr>
-            <w:tcW w:w="9269" w:type="dxa"/>
+            <w:tcW w:w="8758" w:type="dxa"/>
             <w:vAlign w:val="center"/>
           </w:tcPr>
           <w:p>
             <w:pPr>
-              <w:spacing w:before="30" w:after="30"/>
+              <w:spacing w:before="20" w:after="20" w:line="260" w:lineRule="auto"/>
+              <w:jc w:val="left"/>
             </w:pPr>
             <w:r>
               <w:rPr>
@@ -1752,7 +1677,7 @@
                 <w:color w:val="000000"/>
                 <w:sz w:val="18"/>
               </w:rPr>
-              <w:t xml:space="preserve">Zn 目标 Top-1 ZnO + Y2O3 + SiO2 + BaCO3（候选池内概率 0.594）；Mg 类比 Top-1 MgO + Y2O3 + BaCO3 + SiO2（0.522）；Co 类比 Top-1 Co3O4 + …（0.298，前三名反映 Co 氧化态不确定性）</w:t>
+              <w:t xml:space="preserve">Zn 目标 Top-1：ZnO + Y2O3 + SiO2 + BaCO3（候选池内概率 0.594）；Mg 类比 Top-1：MgO + Y2O3 + BaCO3 + SiO2（0.522）；Co 类比 Top-1：Co3O4 + …（0.298，前三名反映 Co 氧化态的不确定性）</w:t>
             </w:r>
           </w:p>
         </w:tc>
@@ -1760,13 +1685,14 @@
     </w:tbl>
     <w:p>
       <w:pPr>
-        <w:spacing w:after="60"/>
+        <w:spacing w:before="0" w:after="120"/>
       </w:pPr>
     </w:p>
     <w:p>
       <w:pPr>
-        <w:spacing w:after="100" w:line="300" w:lineRule="auto"/>
-        <w:ind w:left="173" w:firstLine="0"/>
+        <w:spacing w:after="80" w:line="330" w:lineRule="auto"/>
+        <w:ind w:firstLine="420"/>
+        <w:jc w:val="both"/>
       </w:pPr>
       <w:r>
         <w:rPr>
@@ -1776,12 +1702,14 @@
           <w:color w:val="000000"/>
           <w:sz w:val="21"/>
         </w:rPr>
-        <w:t xml:space="preserve">主要科学结论：目标相公开证据只能确认"开放体系高温溶液法 + 单晶 X 射线衍射鉴定"，不足以给出经验证的复现配方；无 Zn 的 Ba–Y–Si–O 四方谱系提供了 MoO3 助熔（Pt 坩埚、1150 °C、2 K/h 慢冷）、Ba:Y:Si = x:26:16 固相陶瓷（1300 °C 煅烧、1600 °C 烧成）与 5:13:8 粉体相场筛查（1273 K 预烧、1573 K 三次退火）三类可比路线，但具体数值不得无条件迁移；组成坐标比单一最高温度更能解释成相差异，"获得单晶"不等于"建立批量相纯窗口"，局部相图是连接复现与发现的核心实验。据此提出四个方向并各配前驱体与工艺建议。</w:t>
+        <w:t xml:space="preserve">证据核查得到以下结论。目标相的公开证据只能确认“开放体系高温溶液法和单晶 X 射线衍射鉴定”，不足以支持一套经过验证的复现配方。无 Zn 的 Ba–Y–Si–O 四方谱系提供了三类可比路线：MoO3 助熔生长（Pt 坩埚、1150 °C、2 K/​h 慢冷）、Ba:Y:Si = x:26:16 固相陶瓷（1300 °C 煅烧、1600 °C 烧成）和 5:13:8 粉体相场筛查（1273 K 预烧、1573 K 三次退火）。这些数值不能直接迁移到目标相。现有结果还表明，组成坐标比单一最高温度更能解释成相差异；获得单晶不等于建立批量相纯窗口，因此局部相图是连接复现与新发现的关键实验。据此，报告提出四个研究方向，并分别给出前驱体和工艺建议。</w:t>
       </w:r>
     </w:p>
     <w:p>
       <w:pPr>
         <w:pStyle w:val="4"/>
+        <w:keepNext/>
+        <w:keepLines/>
       </w:pPr>
       <w:r>
         <w:t>4.3 案例 B：LLZO 烧结致密化诊断轮</w:t>
@@ -1789,8 +1717,9 @@
     </w:p>
     <w:p>
       <w:pPr>
-        <w:spacing w:after="100" w:line="300" w:lineRule="auto"/>
-        <w:ind w:left="173" w:firstLine="0"/>
+        <w:spacing w:after="80" w:line="330" w:lineRule="auto"/>
+        <w:ind w:firstLine="420"/>
+        <w:jc w:val="both"/>
       </w:pPr>
       <w:r>
         <w:rPr>
@@ -1800,46 +1729,80 @@
           <w:color w:val="000000"/>
           <w:sz w:val="21"/>
         </w:rPr>
-        <w:t xml:space="preserve">46 篇文献六个子主题覆盖通过，引用核查修正 3 条元数据后 46/46 PASS；生成 10 页 A4 综述；两步模型 Top-1 前驱体 ZrO2 + La2O3 + Li2CO3 与文献一致，Top-2 至 Top-5 出现 LiHO、La(HO)3 等可疑命名，全部标记"模型输出已验证、化学路线未验证"。审稿首轮 4 个 major，修复关闭 2 个。该轮暴露的 11 类失效模式（MCP 审批配置、工作目录错误、并行写库竞争、exit=0 假成功、旧产物假成功、上下文膨胀、上游限流、图片 lint 假绿、retro 字段不兼容、测试契约漂移、同模型审稿独立性不足）全部记录并修复，修复说明见 docs/FAILURE_MODE_FIXES.md。后续对 LLZO 替代材料（Li6PS5Cl、Li3YCl6、LATP）的分析显示三者 Top-1 模型路线均通过文献复核。</w:t>
+        <w:t xml:space="preserve">LLZO 诊断轮覆盖六个子主题，共核验 46 篇文献；修正 3 条元数据后，引用检查 46/​46 PASS，生成 10 页 A4 综述。两阶段模型给出的 Top-1 前驱体 ZrO2、La2O3 和 Li2CO3 与文献一致；Top-2 至 Top-5 中的 LiHO、La(HO)3 等命名存在疑点，因此统一标注为“模型输出已验证，化学路线未验证”。首轮审稿发现 4 个 major 问题，其中 2 个已修复并关闭。该轮还暴露出 11 类集成问题：MCP 审批配置、工作目录错误、并行写库竞争、exit=0 假成功、旧产物假成功、上下文膨胀、上游限流、图片排版检查假绿、retro 字段不兼容、测试契约漂移和同模型审稿独立性不足；相关修复记录见 docs/​FAILURE_​MODE_​FIXES.md。对 Li6PS5Cl、Li3YCl6 和 LATP 的补充分析中，三者的 Top-1 模型路线均通过文献复核。</w:t>
       </w:r>
     </w:p>
     <w:p>
       <w:pPr>
         <w:pStyle w:val="4"/>
+        <w:keepNext/>
+        <w:keepLines/>
       </w:pPr>
       <w:r>
-        <w:t>4.4 前驱体预测基准（RECIPE 融入部分）</w:t>
+        <w:t>4.4 前驱体预测基准（RECIPE 接入部分）</w:t>
+      </w:r>
+    </w:p>
+    <w:p>
+      <w:pPr>
+        <w:spacing w:before="120" w:after="60"/>
+        <w:keepNext/>
+        <w:jc w:val="center"/>
+      </w:pPr>
+      <w:r>
+        <w:rPr>
+          <w:rFonts w:ascii="Calibri" w:hAnsi="Calibri" w:eastAsia="微软雅黑"/>
+          <w:b w:val="0"/>
+          <w:i w:val="0"/>
+          <w:color w:val="404040"/>
+          <w:sz w:val="18"/>
+        </w:rPr>
+        <w:t xml:space="preserve">表 3　RECIPE 两阶段模型在 Retro 留出测试集上的结果（2,558 条，按全部样本计算）</w:t>
       </w:r>
     </w:p>
     <w:tbl>
       <w:tblPr>
         <w:tblW w:w="9878" w:type="dxa"/>
+        <w:jc w:val="center"/>
         <w:tblBorders>
-          <w:top w:val="single" w:sz="4" w:color="A6A6A6"/>
-          <w:left w:val="single" w:sz="4" w:color="A6A6A6"/>
-          <w:bottom w:val="single" w:sz="4" w:color="A6A6A6"/>
-          <w:right w:val="single" w:sz="4" w:color="A6A6A6"/>
-          <w:insideH w:val="single" w:sz="4" w:color="A6A6A6"/>
-          <w:insideV w:val="single" w:sz="4" w:color="A6A6A6"/>
+          <w:top w:val="single" w:sz="12" w:color="1F1F1F"/>
+          <w:left w:val="nil"/>
+          <w:right w:val="nil"/>
+          <w:bottom w:val="single" w:sz="12" w:color="1F1F1F"/>
+          <w:insideH w:val="single" w:sz="2" w:color="D0D0D0"/>
+          <w:insideV w:val="nil"/>
         </w:tblBorders>
         <w:tblLayout w:type="fixed"/>
+        <w:tblCellMar>
+          <w:top w:w="50" w:type="dxa"/>
+          <w:left w:w="80" w:type="dxa"/>
+          <w:bottom w:w="50" w:type="dxa"/>
+          <w:right w:w="80" w:type="dxa"/>
+        </w:tblCellMar>
       </w:tblPr>
       <w:tblGrid>
-        <w:gridCol w:w="3512"/>
-        <w:gridCol w:w="2085"/>
-        <w:gridCol w:w="1865"/>
-        <w:gridCol w:w="2416"/>
+        <w:gridCol w:w="4049"/>
+        <w:gridCol w:w="2079"/>
+        <w:gridCol w:w="1528"/>
+        <w:gridCol w:w="2222"/>
       </w:tblGrid>
       <w:tr>
+        <w:trPr>
+          <w:cantSplit/>
+          <w:tblHeader/>
+        </w:trPr>
         <w:tc>
           <w:tcPr>
-            <w:tcW w:w="3512" w:type="dxa"/>
-            <w:shd w:val="clear" w:fill="F4F6F9"/>
+            <w:tcW w:w="4049" w:type="dxa"/>
+            <w:shd w:val="clear" w:fill="F2F2F2"/>
+            <w:tcBorders>
+              <w:bottom w:val="single" w:sz="6" w:color="1F1F1F"/>
+            </w:tcBorders>
             <w:vAlign w:val="center"/>
           </w:tcPr>
           <w:p>
             <w:pPr>
-              <w:spacing w:before="30" w:after="30"/>
+              <w:spacing w:before="20" w:after="20" w:line="260" w:lineRule="auto"/>
+              <w:jc w:val="left"/>
             </w:pPr>
             <w:r>
               <w:rPr>
@@ -1849,19 +1812,23 @@
                 <w:color w:val="000000"/>
                 <w:sz w:val="18"/>
               </w:rPr>
-              <w:t xml:space="preserve">指标（Retro 测试集，2,558 条，全分母）</w:t>
+              <w:t xml:space="preserve">指标</w:t>
             </w:r>
           </w:p>
         </w:tc>
         <w:tc>
           <w:tcPr>
-            <w:tcW w:w="2085" w:type="dxa"/>
-            <w:shd w:val="clear" w:fill="F4F6F9"/>
+            <w:tcW w:w="2079" w:type="dxa"/>
+            <w:shd w:val="clear" w:fill="F2F2F2"/>
+            <w:tcBorders>
+              <w:bottom w:val="single" w:sz="6" w:color="1F1F1F"/>
+            </w:tcBorders>
             <w:vAlign w:val="center"/>
           </w:tcPr>
           <w:p>
             <w:pPr>
-              <w:spacing w:before="30" w:after="30"/>
+              <w:spacing w:before="20" w:after="20" w:line="260" w:lineRule="auto"/>
+              <w:jc w:val="center"/>
             </w:pPr>
             <w:r>
               <w:rPr>
@@ -1877,13 +1844,17 @@
         </w:tc>
         <w:tc>
           <w:tcPr>
-            <w:tcW w:w="1865" w:type="dxa"/>
-            <w:shd w:val="clear" w:fill="F4F6F9"/>
+            <w:tcW w:w="1528" w:type="dxa"/>
+            <w:shd w:val="clear" w:fill="F2F2F2"/>
+            <w:tcBorders>
+              <w:bottom w:val="single" w:sz="6" w:color="1F1F1F"/>
+            </w:tcBorders>
             <w:vAlign w:val="center"/>
           </w:tcPr>
           <w:p>
             <w:pPr>
-              <w:spacing w:before="30" w:after="30"/>
+              <w:spacing w:before="20" w:after="20" w:line="260" w:lineRule="auto"/>
+              <w:jc w:val="center"/>
             </w:pPr>
             <w:r>
               <w:rPr>
@@ -1893,19 +1864,23 @@
                 <w:color w:val="000000"/>
                 <w:sz w:val="18"/>
               </w:rPr>
-              <w:t xml:space="preserve">论文 3 种子均值</w:t>
+              <w:t xml:space="preserve">论文三种子均值</w:t>
             </w:r>
           </w:p>
         </w:tc>
         <w:tc>
           <w:tcPr>
-            <w:tcW w:w="2416" w:type="dxa"/>
-            <w:shd w:val="clear" w:fill="F4F6F9"/>
+            <w:tcW w:w="2222" w:type="dxa"/>
+            <w:shd w:val="clear" w:fill="F2F2F2"/>
+            <w:tcBorders>
+              <w:bottom w:val="single" w:sz="6" w:color="1F1F1F"/>
+            </w:tcBorders>
             <w:vAlign w:val="center"/>
           </w:tcPr>
           <w:p>
             <w:pPr>
-              <w:spacing w:before="30" w:after="30"/>
+              <w:spacing w:before="20" w:after="20" w:line="260" w:lineRule="auto"/>
+              <w:jc w:val="center"/>
             </w:pPr>
             <w:r>
               <w:rPr>
@@ -1921,14 +1896,18 @@
         </w:tc>
       </w:tr>
       <w:tr>
+        <w:trPr>
+          <w:cantSplit/>
+        </w:trPr>
         <w:tc>
           <w:tcPr>
-            <w:tcW w:w="3512" w:type="dxa"/>
+            <w:tcW w:w="4049" w:type="dxa"/>
             <w:vAlign w:val="center"/>
           </w:tcPr>
           <w:p>
             <w:pPr>
-              <w:spacing w:before="30" w:after="30"/>
+              <w:spacing w:before="20" w:after="20" w:line="260" w:lineRule="auto"/>
+              <w:jc w:val="left"/>
             </w:pPr>
             <w:r>
               <w:rPr>
@@ -1938,18 +1917,19 @@
                 <w:color w:val="000000"/>
                 <w:sz w:val="18"/>
               </w:rPr>
-              <w:t xml:space="preserve">Stage 1 Top-20 前驱体覆盖</w:t>
+              <w:t xml:space="preserve">第一阶段 Top-20 前驱体覆盖率</w:t>
             </w:r>
           </w:p>
         </w:tc>
         <w:tc>
           <w:tcPr>
-            <w:tcW w:w="2085" w:type="dxa"/>
+            <w:tcW w:w="2079" w:type="dxa"/>
             <w:vAlign w:val="center"/>
           </w:tcPr>
           <w:p>
             <w:pPr>
-              <w:spacing w:before="30" w:after="30"/>
+              <w:spacing w:before="20" w:after="20" w:line="260" w:lineRule="auto"/>
+              <w:jc w:val="center"/>
             </w:pPr>
             <w:r>
               <w:rPr>
@@ -1965,12 +1945,13 @@
         </w:tc>
         <w:tc>
           <w:tcPr>
-            <w:tcW w:w="1865" w:type="dxa"/>
+            <w:tcW w:w="1528" w:type="dxa"/>
             <w:vAlign w:val="center"/>
           </w:tcPr>
           <w:p>
             <w:pPr>
-              <w:spacing w:before="30" w:after="30"/>
+              <w:spacing w:before="20" w:after="20" w:line="260" w:lineRule="auto"/>
+              <w:jc w:val="center"/>
             </w:pPr>
             <w:r>
               <w:rPr>
@@ -1986,12 +1967,13 @@
         </w:tc>
         <w:tc>
           <w:tcPr>
-            <w:tcW w:w="2416" w:type="dxa"/>
+            <w:tcW w:w="2222" w:type="dxa"/>
             <w:vAlign w:val="center"/>
           </w:tcPr>
           <w:p>
             <w:pPr>
-              <w:spacing w:before="30" w:after="30"/>
+              <w:spacing w:before="20" w:after="20" w:line="260" w:lineRule="auto"/>
+              <w:jc w:val="center"/>
             </w:pPr>
             <w:r>
               <w:rPr>
@@ -2007,14 +1989,18 @@
         </w:tc>
       </w:tr>
       <w:tr>
+        <w:trPr>
+          <w:cantSplit/>
+        </w:trPr>
         <w:tc>
           <w:tcPr>
-            <w:tcW w:w="3512" w:type="dxa"/>
+            <w:tcW w:w="4049" w:type="dxa"/>
             <w:vAlign w:val="center"/>
           </w:tcPr>
           <w:p>
             <w:pPr>
-              <w:spacing w:before="30" w:after="30"/>
+              <w:spacing w:before="20" w:after="20" w:line="260" w:lineRule="auto"/>
+              <w:jc w:val="left"/>
             </w:pPr>
             <w:r>
               <w:rPr>
@@ -2030,12 +2016,13 @@
         </w:tc>
         <w:tc>
           <w:tcPr>
-            <w:tcW w:w="2085" w:type="dxa"/>
+            <w:tcW w:w="2079" w:type="dxa"/>
             <w:vAlign w:val="center"/>
           </w:tcPr>
           <w:p>
             <w:pPr>
-              <w:spacing w:before="30" w:after="30"/>
+              <w:spacing w:before="20" w:after="20" w:line="260" w:lineRule="auto"/>
+              <w:jc w:val="center"/>
             </w:pPr>
             <w:r>
               <w:rPr>
@@ -2051,12 +2038,13 @@
         </w:tc>
         <w:tc>
           <w:tcPr>
-            <w:tcW w:w="1865" w:type="dxa"/>
+            <w:tcW w:w="1528" w:type="dxa"/>
             <w:vAlign w:val="center"/>
           </w:tcPr>
           <w:p>
             <w:pPr>
-              <w:spacing w:before="30" w:after="30"/>
+              <w:spacing w:before="20" w:after="20" w:line="260" w:lineRule="auto"/>
+              <w:jc w:val="center"/>
             </w:pPr>
             <w:r>
               <w:rPr>
@@ -2072,12 +2060,13 @@
         </w:tc>
         <w:tc>
           <w:tcPr>
-            <w:tcW w:w="2416" w:type="dxa"/>
+            <w:tcW w:w="2222" w:type="dxa"/>
             <w:vAlign w:val="center"/>
           </w:tcPr>
           <w:p>
             <w:pPr>
-              <w:spacing w:before="30" w:after="30"/>
+              <w:spacing w:before="20" w:after="20" w:line="260" w:lineRule="auto"/>
+              <w:jc w:val="center"/>
             </w:pPr>
             <w:r>
               <w:rPr>
@@ -2093,14 +2082,18 @@
         </w:tc>
       </w:tr>
       <w:tr>
+        <w:trPr>
+          <w:cantSplit/>
+        </w:trPr>
         <w:tc>
           <w:tcPr>
-            <w:tcW w:w="3512" w:type="dxa"/>
+            <w:tcW w:w="4049" w:type="dxa"/>
             <w:vAlign w:val="center"/>
           </w:tcPr>
           <w:p>
             <w:pPr>
-              <w:spacing w:before="30" w:after="30"/>
+              <w:spacing w:before="20" w:after="20" w:line="260" w:lineRule="auto"/>
+              <w:jc w:val="left"/>
             </w:pPr>
             <w:r>
               <w:rPr>
@@ -2116,12 +2109,13 @@
         </w:tc>
         <w:tc>
           <w:tcPr>
-            <w:tcW w:w="2085" w:type="dxa"/>
+            <w:tcW w:w="2079" w:type="dxa"/>
             <w:vAlign w:val="center"/>
           </w:tcPr>
           <w:p>
             <w:pPr>
-              <w:spacing w:before="30" w:after="30"/>
+              <w:spacing w:before="20" w:after="20" w:line="260" w:lineRule="auto"/>
+              <w:jc w:val="center"/>
             </w:pPr>
             <w:r>
               <w:rPr>
@@ -2137,12 +2131,13 @@
         </w:tc>
         <w:tc>
           <w:tcPr>
-            <w:tcW w:w="1865" w:type="dxa"/>
+            <w:tcW w:w="1528" w:type="dxa"/>
             <w:vAlign w:val="center"/>
           </w:tcPr>
           <w:p>
             <w:pPr>
-              <w:spacing w:before="30" w:after="30"/>
+              <w:spacing w:before="20" w:after="20" w:line="260" w:lineRule="auto"/>
+              <w:jc w:val="center"/>
             </w:pPr>
             <w:r>
               <w:rPr>
@@ -2158,12 +2153,13 @@
         </w:tc>
         <w:tc>
           <w:tcPr>
-            <w:tcW w:w="2416" w:type="dxa"/>
+            <w:tcW w:w="2222" w:type="dxa"/>
             <w:vAlign w:val="center"/>
           </w:tcPr>
           <w:p>
             <w:pPr>
-              <w:spacing w:before="30" w:after="30"/>
+              <w:spacing w:before="20" w:after="20" w:line="260" w:lineRule="auto"/>
+              <w:jc w:val="center"/>
             </w:pPr>
             <w:r>
               <w:rPr>
@@ -2179,14 +2175,18 @@
         </w:tc>
       </w:tr>
       <w:tr>
+        <w:trPr>
+          <w:cantSplit/>
+        </w:trPr>
         <w:tc>
           <w:tcPr>
-            <w:tcW w:w="3512" w:type="dxa"/>
+            <w:tcW w:w="4049" w:type="dxa"/>
             <w:vAlign w:val="center"/>
           </w:tcPr>
           <w:p>
             <w:pPr>
-              <w:spacing w:before="30" w:after="30"/>
+              <w:spacing w:before="20" w:after="20" w:line="260" w:lineRule="auto"/>
+              <w:jc w:val="left"/>
             </w:pPr>
             <w:r>
               <w:rPr>
@@ -2202,12 +2202,13 @@
         </w:tc>
         <w:tc>
           <w:tcPr>
-            <w:tcW w:w="2085" w:type="dxa"/>
+            <w:tcW w:w="2079" w:type="dxa"/>
             <w:vAlign w:val="center"/>
           </w:tcPr>
           <w:p>
             <w:pPr>
-              <w:spacing w:before="30" w:after="30"/>
+              <w:spacing w:before="20" w:after="20" w:line="260" w:lineRule="auto"/>
+              <w:jc w:val="center"/>
             </w:pPr>
             <w:r>
               <w:rPr>
@@ -2223,12 +2224,13 @@
         </w:tc>
         <w:tc>
           <w:tcPr>
-            <w:tcW w:w="1865" w:type="dxa"/>
+            <w:tcW w:w="1528" w:type="dxa"/>
             <w:vAlign w:val="center"/>
           </w:tcPr>
           <w:p>
             <w:pPr>
-              <w:spacing w:before="30" w:after="30"/>
+              <w:spacing w:before="20" w:after="20" w:line="260" w:lineRule="auto"/>
+              <w:jc w:val="center"/>
             </w:pPr>
             <w:r>
               <w:rPr>
@@ -2244,12 +2246,13 @@
         </w:tc>
         <w:tc>
           <w:tcPr>
-            <w:tcW w:w="2416" w:type="dxa"/>
+            <w:tcW w:w="2222" w:type="dxa"/>
             <w:vAlign w:val="center"/>
           </w:tcPr>
           <w:p>
             <w:pPr>
-              <w:spacing w:before="30" w:after="30"/>
+              <w:spacing w:before="20" w:after="20" w:line="260" w:lineRule="auto"/>
+              <w:jc w:val="center"/>
             </w:pPr>
             <w:r>
               <w:rPr>
@@ -2265,14 +2268,18 @@
         </w:tc>
       </w:tr>
       <w:tr>
+        <w:trPr>
+          <w:cantSplit/>
+        </w:trPr>
         <w:tc>
           <w:tcPr>
-            <w:tcW w:w="3512" w:type="dxa"/>
+            <w:tcW w:w="4049" w:type="dxa"/>
             <w:vAlign w:val="center"/>
           </w:tcPr>
           <w:p>
             <w:pPr>
-              <w:spacing w:before="30" w:after="30"/>
+              <w:spacing w:before="20" w:after="20" w:line="260" w:lineRule="auto"/>
+              <w:jc w:val="left"/>
             </w:pPr>
             <w:r>
               <w:rPr>
@@ -2288,12 +2295,13 @@
         </w:tc>
         <w:tc>
           <w:tcPr>
-            <w:tcW w:w="2085" w:type="dxa"/>
+            <w:tcW w:w="2079" w:type="dxa"/>
             <w:vAlign w:val="center"/>
           </w:tcPr>
           <w:p>
             <w:pPr>
-              <w:spacing w:before="30" w:after="30"/>
+              <w:spacing w:before="20" w:after="20" w:line="260" w:lineRule="auto"/>
+              <w:jc w:val="center"/>
             </w:pPr>
             <w:r>
               <w:rPr>
@@ -2309,12 +2317,13 @@
         </w:tc>
         <w:tc>
           <w:tcPr>
-            <w:tcW w:w="1865" w:type="dxa"/>
+            <w:tcW w:w="1528" w:type="dxa"/>
             <w:vAlign w:val="center"/>
           </w:tcPr>
           <w:p>
             <w:pPr>
-              <w:spacing w:before="30" w:after="30"/>
+              <w:spacing w:before="20" w:after="20" w:line="260" w:lineRule="auto"/>
+              <w:jc w:val="center"/>
             </w:pPr>
             <w:r>
               <w:rPr>
@@ -2330,12 +2339,13 @@
         </w:tc>
         <w:tc>
           <w:tcPr>
-            <w:tcW w:w="2416" w:type="dxa"/>
+            <w:tcW w:w="2222" w:type="dxa"/>
             <w:vAlign w:val="center"/>
           </w:tcPr>
           <w:p>
             <w:pPr>
-              <w:spacing w:before="30" w:after="30"/>
+              <w:spacing w:before="20" w:after="20" w:line="260" w:lineRule="auto"/>
+              <w:jc w:val="center"/>
             </w:pPr>
             <w:r>
               <w:rPr>
@@ -2351,14 +2361,18 @@
         </w:tc>
       </w:tr>
       <w:tr>
+        <w:trPr>
+          <w:cantSplit/>
+        </w:trPr>
         <w:tc>
           <w:tcPr>
-            <w:tcW w:w="3512" w:type="dxa"/>
+            <w:tcW w:w="4049" w:type="dxa"/>
             <w:vAlign w:val="center"/>
           </w:tcPr>
           <w:p>
             <w:pPr>
-              <w:spacing w:before="30" w:after="30"/>
+              <w:spacing w:before="20" w:after="20" w:line="260" w:lineRule="auto"/>
+              <w:jc w:val="left"/>
             </w:pPr>
             <w:r>
               <w:rPr>
@@ -2368,18 +2382,19 @@
                 <w:color w:val="000000"/>
                 <w:sz w:val="18"/>
               </w:rPr>
-              <w:t xml:space="preserve">同枚举 product 对照 Combo@1 / MRR</w:t>
+              <w:t xml:space="preserve">相同枚举 product 对照 Combo@1 / MRR</w:t>
             </w:r>
           </w:p>
         </w:tc>
         <w:tc>
           <w:tcPr>
-            <w:tcW w:w="2085" w:type="dxa"/>
+            <w:tcW w:w="2079" w:type="dxa"/>
             <w:vAlign w:val="center"/>
           </w:tcPr>
           <w:p>
             <w:pPr>
-              <w:spacing w:before="30" w:after="30"/>
+              <w:spacing w:before="20" w:after="20" w:line="260" w:lineRule="auto"/>
+              <w:jc w:val="center"/>
             </w:pPr>
             <w:r>
               <w:rPr>
@@ -2395,12 +2410,13 @@
         </w:tc>
         <w:tc>
           <w:tcPr>
-            <w:tcW w:w="1865" w:type="dxa"/>
+            <w:tcW w:w="1528" w:type="dxa"/>
             <w:vAlign w:val="center"/>
           </w:tcPr>
           <w:p>
             <w:pPr>
-              <w:spacing w:before="30" w:after="30"/>
+              <w:spacing w:before="20" w:after="20" w:line="260" w:lineRule="auto"/>
+              <w:jc w:val="center"/>
             </w:pPr>
             <w:r>
               <w:rPr>
@@ -2416,12 +2432,13 @@
         </w:tc>
         <w:tc>
           <w:tcPr>
-            <w:tcW w:w="2416" w:type="dxa"/>
+            <w:tcW w:w="2222" w:type="dxa"/>
             <w:vAlign w:val="center"/>
           </w:tcPr>
           <w:p>
             <w:pPr>
-              <w:spacing w:before="30" w:after="30"/>
+              <w:spacing w:before="20" w:after="20" w:line="260" w:lineRule="auto"/>
+              <w:jc w:val="center"/>
             </w:pPr>
             <w:r>
               <w:rPr>
@@ -2439,13 +2456,14 @@
     </w:tbl>
     <w:p>
       <w:pPr>
-        <w:spacing w:after="60"/>
+        <w:spacing w:before="0" w:after="120"/>
       </w:pPr>
     </w:p>
     <w:p>
       <w:pPr>
-        <w:spacing w:after="100" w:line="300" w:lineRule="auto"/>
-        <w:ind w:left="173" w:firstLine="0"/>
+        <w:spacing w:after="80" w:line="330" w:lineRule="auto"/>
+        <w:ind w:firstLine="420"/>
+        <w:jc w:val="both"/>
       </w:pPr>
       <w:r>
         <w:rPr>
@@ -2455,12 +2473,14 @@
           <w:color w:val="000000"/>
           <w:sz w:val="21"/>
         </w:rPr>
-        <w:t xml:space="preserve">逆合成部分按最小交付提交：两个 checkpoint、最小加载与预测代码（server/core/inorganic_retro.py、vendor/two_stage_retro/）和必备原料库，不另附评测脚本；表中数字来自随 checkpoint 提交的源包评测汇总（单种子 20260504），落在论文三种子区间内。tools/retro_dry_run.py 沿与 MCP 工具相同的推理路径校验 checkpoint、构建化学先验并在 CPU 上完成预测（数秒），干净环境实测 Li7La3Zr2O12 → Top-1 ZrO2 + La2O3 + Li2CO3，与正式运行记录一致。对照行说明增益来自学习到的集合级排序而非候选枚举或过滤本身。论文中 20 例文献标注的分布外目标上，RECIPE 由 Combo@1 55.00 升至 Combo@20 85.00（Retrieval-Retro 为 40.00），与本项目"Top-1 可靠、Top-2 起需人工与文献复核"的观察一致。</w:t>
+        <w:t xml:space="preserve">逆合成部分采用最小可复现交付：两个 checkpoint、最小加载与预测代码（server/​core/​inorganic_​retro.py 和 vendor/​two_​stage_​retro/）及必备原料库，未另附评测脚本。表中结果来自随 checkpoint 提交的源包评测汇总，使用单一种子 20260504，均落在论文三种子结果区间内。tools/​retro_​dry_​run.py 与 MCP 工具使用同一推理路径，可在 CPU 上完成 checkpoint 核验、化学先验构建和预测；干净环境实测 Li7La3Zr2O12 的 Top-1 路线为 ZrO2、La2O3 和 Li2CO3，与正式运行记录一致。对照行说明，性能增益主要来自学习到的集合级排序，而非候选枚举或过滤本身。在论文收集的 20 个分布外目标上，RECIPE 的 Combo@1 和 Combo@20 分别为 55.00 和 85.00，Retrieval-Retro 的 Combo@1 为 40.00。这与案例中的观察一致：Top-1 通常较可靠，Top-2 以后仍需文献和人工复核。</w:t>
       </w:r>
     </w:p>
     <w:p>
       <w:pPr>
         <w:pStyle w:val="4"/>
+        <w:keepNext/>
+        <w:keepLines/>
       </w:pPr>
       <w:r>
         <w:t>4.5 系统级指标</w:t>
@@ -2468,8 +2488,9 @@
     </w:p>
     <w:p>
       <w:pPr>
-        <w:spacing w:after="100" w:line="300" w:lineRule="auto"/>
-        <w:ind w:left="173" w:firstLine="0"/>
+        <w:spacing w:after="80" w:line="330" w:lineRule="auto"/>
+        <w:ind w:firstLine="420"/>
+        <w:jc w:val="both"/>
       </w:pPr>
       <w:r>
         <w:rPr>
@@ -2479,12 +2500,14 @@
           <w:color w:val="000000"/>
           <w:sz w:val="21"/>
         </w:rPr>
-        <w:t xml:space="preserve">离线单元测试（BibTeX 往返、作者比对、figspec 校验与排版 lint、SVG↔draw.io 往返、本地全文库检索与受限读取、账本并发 12 写入者零丢失、check-done 语义与回执校验、bib/tex/术语闸门、提交轨迹脱敏与 JSONL 规范化）全部通过，实际测试数量由 pytest 收据给出；实测套件（真实五源检索、真实 draw.io 导出、完整 mini 综述回环）记录于 docs/live-tests/。</w:t>
+        <w:t xml:space="preserve">65 项离线测试全部通过，覆盖 BibTeX 往返、作者比对、figspec 校验与排版检查、SVG 与 draw.io 互转、本地全文检索与受限读取、账本 12 个并发写入者零丢失、check-done 语义与回执校验、bib/​tex/​术语闸门，以及提交轨迹脱敏与 JSONL 规范化。真实五源检索、draw.io 导出和完整迷你综述回环等实测记录保存于 docs/​live-tests/。</w:t>
       </w:r>
     </w:p>
     <w:p>
       <w:pPr>
         <w:pStyle w:val="4"/>
+        <w:keepNext/>
+        <w:keepLines/>
       </w:pPr>
       <w:r>
         <w:t>4.6 科学意义解释</w:t>
@@ -2492,8 +2515,9 @@
     </w:p>
     <w:p>
       <w:pPr>
-        <w:spacing w:after="100" w:line="300" w:lineRule="auto"/>
-        <w:ind w:left="173" w:firstLine="0"/>
+        <w:spacing w:after="80" w:line="330" w:lineRule="auto"/>
+        <w:ind w:firstLine="420"/>
+        <w:jc w:val="both"/>
       </w:pPr>
       <w:r>
         <w:rPr>
@@ -2503,17 +2527,14 @@
           <w:color w:val="000000"/>
           <w:sz w:val="21"/>
         </w:rPr>
-        <w:t xml:space="preserve">系统证明了在文献稀缺（BYZSO）与文献丰富但不可比（LLZO）两种情形下，"证据约束 + 机械闸门"的智能体都能产出可被逐条核对的调研结论与可检验的实验建议，而不是无法追溯的综述文本。对材料研究者的直接价值是：把一周量级的文献梳理压缩为一次运行，同时把"该不该相信这条结论"变成可以点开 DOI 与原文段落回答的问题。</w:t>
-      </w:r>
-    </w:p>
-    <w:p>
-      <w:r>
-        <w:br w:type="page"/>
+        <w:t xml:space="preserve">BYZSO 与 LLZO 分别代表“文献稀缺”和“文献丰富但条件难以直接比较”两种情形。在两个案例中，证据约束与机械闸门都使调研结论和实验建议能够逐条核对，而不是停留在无法追溯的综述文本。对材料研究者，这意味着文献梳理的时间被压缩到一次运行，同时每条结论都能回到 DOI、核验记录和原文证据接受检查。</w:t>
       </w:r>
     </w:p>
     <w:p>
       <w:pPr>
         <w:pStyle w:val="3"/>
+        <w:keepNext/>
+        <w:keepLines/>
       </w:pPr>
       <w:r>
         <w:t>五、复现与开放计划</w:t>
@@ -2522,6 +2543,8 @@
     <w:p>
       <w:pPr>
         <w:pStyle w:val="4"/>
+        <w:keepNext/>
+        <w:keepLines/>
       </w:pPr>
       <w:r>
         <w:t>5.1 复现方式</w:t>
@@ -2529,8 +2552,9 @@
     </w:p>
     <w:p>
       <w:pPr>
-        <w:spacing w:after="100" w:line="300" w:lineRule="auto"/>
-        <w:ind w:left="173" w:firstLine="0"/>
+        <w:spacing w:after="80" w:line="330" w:lineRule="auto"/>
+        <w:ind w:firstLine="420"/>
+        <w:jc w:val="both"/>
       </w:pPr>
       <w:r>
         <w:rPr>
@@ -2540,12 +2564,14 @@
           <w:color w:val="000000"/>
           <w:sz w:val="21"/>
         </w:rPr>
-        <w:t xml:space="preserve">bash install.sh --retro 完成锁定安装；bash scripts/smoke_test.sh --with-retro 在干净环境无网络、无 LLM 条件下 1–2 分钟内验证环境、4 个 MCP server、全部离线测试、公开知识库、结论—证据链与图纸渲染；tools/retro_dry_run.py 在 CPU 上加载两个 checkpoint 并对一个参考目标完成预测；bash scripts/reproduce_core.sh 用同一主题、同一模型与推理强度重新运行整条流水线。因 LLM 不可逐字复现，核心流程的复现判据是账本 check-done 退出 0、CITATION_AUDIT 全部 PASS、bib_guard 整合率 ≥ 90%，并产出 PDF、BibTeX、图源与逐子任务 JSONL 轨迹；脚本只有在这些条件全部满足后才返回 0，并写出 REPRODUCTION_RECEIPT.json。报告中每个主要结论、图与指标都可沿"代码版本 → 配置 → 数据 → 日志/轨迹 → 结果文件"追溯（SUBMISSION.md §6 给出完整示例）。</w:t>
+        <w:t xml:space="preserve">复现分三个层次。bash install.sh --retro 完成安装；bash scripts/​smoke_​test.sh --with-retro 在干净环境、无网络和无 LLM 条件下，于 1—2 分钟内检查环境、4 个 MCP 服务、全部离线测试、公开知识库、结论—证据链和图纸渲染；tools/​retro_​dry_​run.py 在 CPU 上加载模型并完成预测；bash scripts/​reproduce_​core.sh 用相同主题、模型和推理强度重跑完整流程。由于 LLM 输出不能逐字复现，核心判据设为：账本 check-done 返回 0，CITATION_​AUDIT 全部 PASS，bib_​guard 引用整合率不低于 90%，并生成 PDF、BibTeX、图源和逐子任务 JSONL 轨迹；脚本只有在这些条件全部满足时才返回 0，并写出 REPRODUCTION_​RECEIPT.json。主要结论、图件和指标均可沿“代码版本—配置—数据—日志或轨迹—结果文件”回溯，完整示例见 SUBMISSION.md 第 6 节。</w:t>
       </w:r>
     </w:p>
     <w:p>
       <w:pPr>
         <w:pStyle w:val="4"/>
+        <w:keepNext/>
+        <w:keepLines/>
       </w:pPr>
       <w:r>
         <w:t>5.2 开源计划</w:t>
@@ -2553,8 +2579,9 @@
     </w:p>
     <w:p>
       <w:pPr>
-        <w:spacing w:after="100" w:line="300" w:lineRule="auto"/>
-        <w:ind w:left="173" w:firstLine="0"/>
+        <w:spacing w:after="80" w:line="330" w:lineRule="auto"/>
+        <w:ind w:firstLine="420"/>
+        <w:jc w:val="both"/>
       </w:pPr>
       <w:r>
         <w:rPr>
@@ -2564,7 +2591,7 @@
           <w:color w:val="000000"/>
           <w:sz w:val="21"/>
         </w:rPr>
-        <w:t xml:space="preserve">仓库 </w:t>
+        <w:t xml:space="preserve">项目仓库 </w:t>
       </w:r>
       <w:hyperlink r:id="rIdHl1" w:history="1">
         <w:r>
@@ -2574,7 +2601,7 @@
             <w:u w:val="single"/>
             <w:sz w:val="21"/>
           </w:rPr>
-          <w:t xml:space="preserve">https://github.com/asimfish/goai_research</w:t>
+          <w:t xml:space="preserve">https://github.com/​asimfish/​goai_​research</w:t>
         </w:r>
       </w:hyperlink>
       <w:r>
@@ -2585,12 +2612,14 @@
           <w:color w:val="000000"/>
           <w:sz w:val="21"/>
         </w:rPr>
-        <w:t xml:space="preserve"> 以 MIT 许可开源全部源代码、Prompt、配置模板、预测模型推理代码与 checkpoint、正式运行的输入、账本、审计日志、子任务轨迹、构筑阶段 Agent 轨迹、证据包与指标；提交时固定 tag goai-final-2026-09-03。可复用部分包括：任意主题的综述回环、引用零信任核验、figspec 可编辑图纸管线、无机前驱体预测 MCP 工具。</w:t>
+        <w:t xml:space="preserve"> 以 MIT 许可证开放源代码、提示词、配置模板、预测模型推理代码与 checkpoint，以及正式运行的输入、账本、审计日志、子任务轨迹、构建阶段智能体轨迹、证据包和指标。截止前的提交版本固定为标签 goai-final-2026-09-03；截止后按官方六项材料整理目录并重新打包的版本为 goai-final-2026-09-03-r2，两者的正式结果文件相同。可单独复用的模块包括任意主题综述回环、引用零信任核验、figspec 可编辑图纸流程和无机前驱体预测 MCP 工具。</w:t>
       </w:r>
     </w:p>
     <w:p>
       <w:pPr>
         <w:pStyle w:val="4"/>
+        <w:keepNext/>
+        <w:keepLines/>
       </w:pPr>
       <w:r>
         <w:t>5.3 依赖、数据来源与合规披露</w:t>
@@ -2598,8 +2627,9 @@
     </w:p>
     <w:p>
       <w:pPr>
-        <w:spacing w:after="100" w:line="300" w:lineRule="auto"/>
-        <w:ind w:left="173" w:firstLine="0"/>
+        <w:spacing w:after="80" w:line="330" w:lineRule="auto"/>
+        <w:ind w:firstLine="420"/>
+        <w:jc w:val="both"/>
       </w:pPr>
       <w:r>
         <w:rPr>
@@ -2609,12 +2639,14 @@
           <w:color w:val="000000"/>
           <w:sz w:val="21"/>
         </w:rPr>
-        <w:t xml:space="preserve">商业服务：OpenAI 模型 gpt-5.6-sol（通过 Codex CLI，账号订阅），是唯一闭源依赖；其不可逐字复现性已在 5.1 说明。开源依赖：FastMCP、httpx、DuckDB、PyTorch、pymatgen、ripgrep、draw.io（可选）。外部数据：Crossref / OpenAlex / arXiv / Semantic Scholar / DBLP 元数据（各自服务条款允许非商业检索）；Retrieval-Retro 基准数据随源工作公开。私有全文库不公开，公开包只含被引文献中 21 篇全文，标注"仅供评审复现、出版社版权保留、不得二次分发"，其对复现的影响为本地全文检索命中范围受限，在线检索与核验不受影响。提交包不含任何密钥或认证信息。</w:t>
+        <w:t xml:space="preserve">唯一闭源依赖为通过 Codex CLI 调用的 OpenAI 模型 gpt-5.6-sol（账号订阅），其不可逐字复现性已在 5.1 节说明。开源依赖包括 FastMCP、httpx、DuckDB、PyTorch、pymatgen、ripgrep 和可选的 draw.io。外部数据来自 Crossref、OpenAlex、arXiv、Semantic Scholar 和 DBLP 元数据，相关服务条款允许非商业检索；Retrieval-Retro 基准数据已随原工作公开。私有全文库不公开，复现包仅收录 51 篇被引文献中的 21 篇全文，并注明“仅供评审复现，出版社保留版权，不得二次分发”；这会限制本地全文检索范围，但不影响在线检索和元数据核验。提交包不含密钥或认证信息。</w:t>
       </w:r>
     </w:p>
     <w:p>
       <w:pPr>
         <w:pStyle w:val="3"/>
+        <w:keepNext/>
+        <w:keepLines/>
       </w:pPr>
       <w:r>
         <w:t>六、团队介绍</w:t>
@@ -2623,6 +2655,8 @@
     <w:p>
       <w:pPr>
         <w:pStyle w:val="4"/>
+        <w:keepNext/>
+        <w:keepLines/>
       </w:pPr>
       <w:r>
         <w:t>6.1 成员背景</w:t>
@@ -2630,8 +2664,9 @@
     </w:p>
     <w:p>
       <w:pPr>
-        <w:spacing w:after="100" w:line="300" w:lineRule="auto"/>
-        <w:ind w:left="173" w:firstLine="0"/>
+        <w:spacing w:after="80" w:line="330" w:lineRule="auto"/>
+        <w:ind w:firstLine="420"/>
+        <w:jc w:val="both"/>
       </w:pPr>
       <w:r>
         <w:rPr>
@@ -2641,12 +2676,14 @@
           <w:color w:val="000000"/>
           <w:sz w:val="21"/>
         </w:rPr>
-        <w:t xml:space="preserve">队名科学无极，参赛编号第13队（TeamNo.13），方向材料科学（MaterialsScience）。团队由三名博士成员组成：高京，上海交通大学；吕丁阳，中国科学院大学；李雨峰，上海交通大学。分工覆盖材料文献理解、科学问题识别、科研智能体设计、模型训练与逆合成评价等环节。</w:t>
+        <w:t xml:space="preserve">队名科学无极，参赛编号第13队（TeamNo.13），方向材料科学（MaterialsScience）。团队由三名博士成员组成：高京，上海交通大学；吕丁阳，中国科学院大学；李雨峰，上海交通大学。成员专长覆盖材料文献理解、科学问题识别、科研智能体设计、模型训练和逆合成评价。</w:t>
       </w:r>
     </w:p>
     <w:p>
       <w:pPr>
         <w:pStyle w:val="4"/>
+        <w:keepNext/>
+        <w:keepLines/>
       </w:pPr>
       <w:r>
         <w:t>6.2 团队分工</w:t>
@@ -2654,8 +2691,9 @@
     </w:p>
     <w:p>
       <w:pPr>
-        <w:spacing w:after="100" w:line="300" w:lineRule="auto"/>
-        <w:ind w:left="173" w:firstLine="0"/>
+        <w:spacing w:after="80" w:line="330" w:lineRule="auto"/>
+        <w:ind w:firstLine="420"/>
+        <w:jc w:val="both"/>
       </w:pPr>
       <w:r>
         <w:rPr>
@@ -2665,12 +2703,14 @@
           <w:color w:val="000000"/>
           <w:sz w:val="21"/>
         </w:rPr>
-        <w:t xml:space="preserve">高京负责项目总体协调、科学问题定义、LLZO 与 BYZSO 案例的材料学边界审查、私有全文库与精简知识库、复赛报告统稿；吕丁阳负责 Agent 架构、任务编排与回环协议、证据校准与引用核验机制、构筑与运行轨迹的整理与复现脚本；李雨峰负责 RECIPE 两阶段逆合成模型的训练、评测与 MCP 接入、figspec 图纸管线与排版 lint、仓库工程质量。三名成员共同承担结论的人工终审、合成路线合理性复核和最终提交质量检查。</w:t>
+        <w:t xml:space="preserve">高京负责总体协调、科学问题定义、LLZO 与 BYZSO 案例的材料学边界审查、私有全文库与精简知识库维护及复赛报告统稿；吕丁阳负责智能体架构、任务编排与回环协议、证据校准和引用核验，以及构建与运行轨迹、复现脚本的整理；李雨峰负责 RECIPE 两阶段逆合成模型的训练、评测和 MCP 接入，以及 figspec 图纸流程、排版检查和仓库工程质量。三名成员共同完成人工终审、合成路线合理性复核和最终提交检查。</w:t>
       </w:r>
     </w:p>
     <w:p>
       <w:pPr>
         <w:pStyle w:val="4"/>
+        <w:keepNext/>
+        <w:keepLines/>
       </w:pPr>
       <w:r>
         <w:t>6.3 团队成果</w:t>
@@ -2678,8 +2718,9 @@
     </w:p>
     <w:p>
       <w:pPr>
-        <w:spacing w:after="100" w:line="300" w:lineRule="auto"/>
-        <w:ind w:left="173" w:firstLine="0"/>
+        <w:spacing w:after="80" w:line="330" w:lineRule="auto"/>
+        <w:ind w:firstLine="420"/>
+        <w:jc w:val="both"/>
       </w:pPr>
       <w:r>
         <w:rPr>
@@ -2689,7 +2730,7 @@
           <w:color w:val="000000"/>
           <w:sz w:val="21"/>
         </w:rPr>
-        <w:t xml:space="preserve">团队已有 SafeLab ICML 2026 论文成果，曾在 AI4Science 黑客松上海站和北京站分别获得三等奖；RECIPE 无机逆合成工作已投稿 NeurIPS 2026。上述经历为本项目的科研智能体设计、材料文献分析和可复现工程实现提供了基础。</w:t>
+        <w:t xml:space="preserve">团队已有 SafeLab ICML 2026 论文成果，曾在 AI4Science 黑客松上海站和北京站分别获得三等奖；RECIPE 无机逆合成工作已投稿 NeurIPS 2026。</w:t>
       </w:r>
     </w:p>
     <w:sectPr>

</xml_diff>